<commit_message>
fix(app): bind demo to localhost, disable public share, add optional auth; correct 3D tab label
- unified_app.py: launch() now binds 127.0.0.1:7860 with share=False
  (was 0.0.0.0 + share=True = public tunnel, no auth, over social-work case data)
- add optional auth via GRADIO_USER/GRADIO_PASS env vars
- add missing 'import os' (os.getenv was used at launch, would NameError)
- 3D tab: remove misleading '768D -> 3D' label; coordinates are score-derived,
  not an embedding projection. DR dropdown runs on synthetic embeddings and is
  disabled unless ALLOW_DEMO_DATA=true
- ch4 4.9 Limitations section + intro updated to 9 sections

184 tests pass.
</commit_message>
<xml_diff>
--- a/ch4_thesis.docx
+++ b/ch4_thesis.docx
@@ -167,7 +167,7 @@
           <w:color w:val="000000"/>
           <w:sz w:val="32"/>
         </w:rPr>
-        <w:t>การรายงานผลแบ่งออกเป็น 8 ส่วนหลัก ได้แก่:</w:t>
+        <w:t>การรายงานผลแบ่งออกเป็น 9 ส่วนหลัก ได้แก่:</w:t>
       </w:r>
     </w:p>
     <w:p>
@@ -368,6 +368,31 @@
           <w:sz w:val="32"/>
         </w:rPr>
         <w:t>กรณีศึกษาเชิงคุณภาพและการวิเคราะห์ข้อผิดพลาด (Qualitative Case Studies &amp; Error Analysis)</w:t>
+      </w:r>
+    </w:p>
+    <w:p>
+      <w:pPr>
+        <w:spacing w:before="20" w:after="60" w:line="276" w:lineRule="auto"/>
+        <w:jc w:val="left"/>
+      </w:pPr>
+      <w:r>
+        <w:rPr>
+          <w:rFonts w:ascii="TH Sarabun PSK" w:hAnsi="TH Sarabun PSK"/>
+          <w:b w:val="0"/>
+          <w:i w:val="0"/>
+          <w:color w:val="000000"/>
+          <w:sz w:val="32"/>
+        </w:rPr>
+        <w:t xml:space="preserve">9. </w:t>
+      </w:r>
+      <w:r>
+        <w:rPr>
+          <w:rFonts w:ascii="TH Sarabun PSK" w:hAnsi="TH Sarabun PSK"/>
+          <w:b/>
+          <w:color w:val="000000"/>
+          <w:sz w:val="32"/>
+        </w:rPr>
+        <w:t>ข้อจำกัดของการทดลองและการตีความผล (Limitations &amp; Interpretation Constraints)</w:t>
       </w:r>
     </w:p>
     <w:p>
@@ -8585,7 +8610,7 @@
           <w:color w:val="000000"/>
           <w:sz w:val="32"/>
         </w:rPr>
-        <w:t>ตารางที่ 4.9 ผลเปรียบเทียบ L1+L2 กับ L1-only (n=95 เคส)</w:t>
+        <w:t>ตารางที่ 4.7 ผลเปรียบเทียบ L1+L2 กับ L1-only (n=95 เคส)</w:t>
       </w:r>
     </w:p>
     <w:tbl>
@@ -9220,6 +9245,22 @@
     </w:p>
     <w:p>
       <w:pPr>
+        <w:spacing w:before="200" w:after="80" w:line="276" w:lineRule="auto"/>
+        <w:jc w:val="left"/>
+      </w:pPr>
+      <w:r>
+        <w:rPr>
+          <w:rFonts w:ascii="TH Sarabun PSK" w:hAnsi="TH Sarabun PSK"/>
+          <w:b/>
+          <w:i w:val="0"/>
+          <w:color w:val="003366"/>
+          <w:sz w:val="36"/>
+        </w:rPr>
+        <w:t>4.6 ผลการทดสอบความทนทานต่อกรณีศึกษาท้าทาย (Adversarial Stress Test)</w:t>
+      </w:r>
+    </w:p>
+    <w:p>
+      <w:pPr>
         <w:spacing w:before="0" w:after="80" w:line="276" w:lineRule="auto"/>
         <w:jc w:val="left"/>
       </w:pPr>
@@ -9250,7 +9291,7 @@
           <w:color w:val="000000"/>
           <w:sz w:val="32"/>
         </w:rPr>
-        <w:t xml:space="preserve"> ซึ่งมีคำปฏิเสธ คีย์เวิร์ดลวง และประโยคซับซ้อน ปรากฏผลการทดลองดังตารางที่ 4.7</w:t>
+        <w:t xml:space="preserve"> ซึ่งมีคำปฏิเสธ คีย์เวิร์ดลวง และประโยคซับซ้อน ปรากฏผลการทดลองดังตารางที่ 4.8</w:t>
       </w:r>
     </w:p>
     <w:p>
@@ -9265,7 +9306,7 @@
           <w:color w:val="000000"/>
           <w:sz w:val="32"/>
         </w:rPr>
-        <w:t>ตารางที่ 4.7 ผลการทดสอบความทนทานบน Adversarial Stress-Test Slice (n=20 เคส, qwen2.5:7b)</w:t>
+        <w:t>ตารางที่ 4.8 ผลการทดสอบความทนทานบน Adversarial Stress-Test Slice (n=20 เคส, qwen2.5:7b)</w:t>
       </w:r>
     </w:p>
     <w:tbl>
@@ -9914,7 +9955,7 @@
           <w:color w:val="000000"/>
           <w:sz w:val="32"/>
         </w:rPr>
-        <w:t>ตารางที่ 4.7ข ผลการตรวจจับปัญหาบน Adversarial Slice (Detector metrics, 3 models × 3 repeats = 180 runs)</w:t>
+        <w:t>ตารางที่ 4.8ข ผลการตรวจจับปัญหาบน Adversarial Slice (Detector metrics, 3 models × 3 repeats = 180 runs)</w:t>
       </w:r>
     </w:p>
     <w:tbl>
@@ -10302,7 +10343,7 @@
           <w:color w:val="000000"/>
           <w:sz w:val="32"/>
         </w:rPr>
-        <w:t>ตารางที่ 4.8 ผล nDCG@10 จำแนกตามระดับความซับซ้อนของเคส (qwen2.5:7b, เฉลี่ย 3 repeats)</w:t>
+        <w:t>ตารางที่ 4.9 ผล nDCG@10 จำแนกตามระดับความซับซ้อนของเคส (qwen2.5:7b, เฉลี่ย 3 repeats)</w:t>
       </w:r>
     </w:p>
     <w:tbl>
@@ -10943,6 +10984,944 @@
           <w:sz w:val="32"/>
         </w:rPr>
         <w:t xml:space="preserve"> Cross-Encoder Reranker ช่วยกรองในขั้นตอนสุดท้าย</w:t>
+      </w:r>
+    </w:p>
+    <w:p>
+      <w:pPr>
+        <w:spacing w:before="120" w:after="120"/>
+        <w:pBdr>
+          <w:bottom w:val="single" w:sz="6" w:space="1" w:color="CCCCCC"/>
+        </w:pBdr>
+      </w:pPr>
+    </w:p>
+    <w:p>
+      <w:pPr>
+        <w:spacing w:before="200" w:after="80" w:line="276" w:lineRule="auto"/>
+        <w:jc w:val="left"/>
+      </w:pPr>
+      <w:r>
+        <w:rPr>
+          <w:rFonts w:ascii="TH Sarabun PSK" w:hAnsi="TH Sarabun PSK"/>
+          <w:b/>
+          <w:i w:val="0"/>
+          <w:color w:val="003366"/>
+          <w:sz w:val="36"/>
+        </w:rPr>
+        <w:t>4.9 ข้อจำกัดของการทดลองและการตีความผล (Limitations)</w:t>
+      </w:r>
+    </w:p>
+    <w:p>
+      <w:pPr>
+        <w:spacing w:before="0" w:after="80" w:line="276" w:lineRule="auto"/>
+        <w:jc w:val="left"/>
+      </w:pPr>
+      <w:r>
+        <w:rPr>
+          <w:rFonts w:ascii="TH Sarabun PSK" w:hAnsi="TH Sarabun PSK"/>
+          <w:b w:val="0"/>
+          <w:i w:val="0"/>
+          <w:color w:val="000000"/>
+          <w:sz w:val="32"/>
+        </w:rPr>
+        <w:t xml:space="preserve">ผลการทดลองในบทนี้ปรากฏรูปแบบที่สอดคล้องกันข้ามการทดลองย่อยหลายรายการ คือ </w:t>
+      </w:r>
+      <w:r>
+        <w:rPr>
+          <w:rFonts w:ascii="TH Sarabun PSK" w:hAnsi="TH Sarabun PSK"/>
+          <w:b/>
+          <w:color w:val="000000"/>
+          <w:sz w:val="32"/>
+        </w:rPr>
+        <w:t>ค่าเฉลี่ยของกลยุทธ์ที่เสนอสูงกว่า baseline แต่ผลต่างรายกรณีเป็นศูนย์ในกรณีศึกษาส่วนใหญ่</w:t>
+      </w:r>
+      <w:r>
+        <w:rPr>
+          <w:rFonts w:ascii="TH Sarabun PSK" w:hAnsi="TH Sarabun PSK"/>
+          <w:b w:val="0"/>
+          <w:i w:val="0"/>
+          <w:color w:val="000000"/>
+          <w:sz w:val="32"/>
+        </w:rPr>
+        <w:t xml:space="preserve"> หัวข้อนี้อธิบายสาเหตุเชิงโครงสร้างของรูปแบบดังกล่าว เพื่อไม่ให้ตีความค่าที่ไม่มีนัยสำคัญทางสถิติว่าเป็นหลักฐานว่ากลไกไม่ทำงาน</w:t>
+      </w:r>
+    </w:p>
+    <w:p>
+      <w:pPr>
+        <w:spacing w:before="160" w:after="60" w:line="276" w:lineRule="auto"/>
+        <w:jc w:val="left"/>
+      </w:pPr>
+      <w:r>
+        <w:rPr>
+          <w:rFonts w:ascii="TH Sarabun PSK" w:hAnsi="TH Sarabun PSK"/>
+          <w:b/>
+          <w:i w:val="0"/>
+          <w:color w:val="003366"/>
+          <w:sz w:val="32"/>
+        </w:rPr>
+        <w:t>4.9.1 ขนาดคลังเอกสารเป็นข้อจำกัดหลัก</w:t>
+      </w:r>
+    </w:p>
+    <w:p>
+      <w:pPr>
+        <w:spacing w:before="0" w:after="80" w:line="276" w:lineRule="auto"/>
+        <w:jc w:val="left"/>
+      </w:pPr>
+      <w:r>
+        <w:rPr>
+          <w:rFonts w:ascii="TH Sarabun PSK" w:hAnsi="TH Sarabun PSK"/>
+          <w:b w:val="0"/>
+          <w:i w:val="0"/>
+          <w:color w:val="000000"/>
+          <w:sz w:val="32"/>
+        </w:rPr>
+        <w:t xml:space="preserve">คลังเอกสารอ้างอิงที่ใช้ในการทดลองประกอบด้วยเอกสาร </w:t>
+      </w:r>
+      <w:r>
+        <w:rPr>
+          <w:rFonts w:ascii="TH Sarabun PSK" w:hAnsi="TH Sarabun PSK"/>
+          <w:b/>
+          <w:color w:val="000000"/>
+          <w:sz w:val="32"/>
+        </w:rPr>
+        <w:t>92 รายการ</w:t>
+      </w:r>
+      <w:r>
+        <w:rPr>
+          <w:rFonts w:ascii="TH Sarabun PSK" w:hAnsi="TH Sarabun PSK"/>
+          <w:b w:val="0"/>
+          <w:i w:val="0"/>
+          <w:color w:val="000000"/>
+          <w:sz w:val="32"/>
+        </w:rPr>
+        <w:t xml:space="preserve"> ขณะที่ข้อกำหนดการดึงเอกสารกำหนดไว้ที่ </w:t>
+      </w:r>
+      <w:r>
+        <w:rPr>
+          <w:rFonts w:ascii="Courier New" w:hAnsi="Courier New"/>
+          <w:color w:val="B42828"/>
+          <w:sz w:val="30"/>
+        </w:rPr>
+        <w:t>top_k = 15</w:t>
+      </w:r>
+      <w:r>
+        <w:rPr>
+          <w:rFonts w:ascii="TH Sarabun PSK" w:hAnsi="TH Sarabun PSK"/>
+          <w:b w:val="0"/>
+          <w:i w:val="0"/>
+          <w:color w:val="000000"/>
+          <w:sz w:val="32"/>
+        </w:rPr>
+        <w:t xml:space="preserve"> เท่ากับการดึงเอกสาร </w:t>
+      </w:r>
+      <w:r>
+        <w:rPr>
+          <w:rFonts w:ascii="TH Sarabun PSK" w:hAnsi="TH Sarabun PSK"/>
+          <w:b/>
+          <w:color w:val="000000"/>
+          <w:sz w:val="32"/>
+        </w:rPr>
+        <w:t>16.3% ของคลังทั้งหมดในทุก query</w:t>
+      </w:r>
+      <w:r>
+        <w:rPr>
+          <w:rFonts w:ascii="TH Sarabun PSK" w:hAnsi="TH Sarabun PSK"/>
+          <w:b w:val="0"/>
+          <w:i w:val="0"/>
+          <w:color w:val="000000"/>
+          <w:sz w:val="32"/>
+        </w:rPr>
+        <w:t xml:space="preserve"> ในเงื่อนไขเช่นนี้ ชุดเอกสารที่ปรากฏในผลลัพธ์ของแต่ละกลยุทธ์จะซ้อนทับกันเกือบทั้งหมดโดยไม่ขึ้นกับฟังก์ชันคะแนนที่ใช้ ทำให้เหลือพื้นที่ให้ลำดับเปลี่ยนแปลงได้จำกัดมาก</w:t>
+      </w:r>
+    </w:p>
+    <w:p>
+      <w:pPr>
+        <w:spacing w:before="0" w:after="80" w:line="276" w:lineRule="auto"/>
+        <w:jc w:val="left"/>
+      </w:pPr>
+      <w:r>
+        <w:rPr>
+          <w:rFonts w:ascii="TH Sarabun PSK" w:hAnsi="TH Sarabun PSK"/>
+          <w:b w:val="0"/>
+          <w:i w:val="0"/>
+          <w:color w:val="000000"/>
+          <w:sz w:val="32"/>
+        </w:rPr>
+        <w:t>ข้อจำกัดนี้อธิบายผลที่สังเกตได้ 4 ประการอย่างสอดคล้องกัน</w:t>
+      </w:r>
+    </w:p>
+    <w:p>
+      <w:pPr>
+        <w:spacing w:before="20" w:after="60" w:line="276" w:lineRule="auto"/>
+        <w:jc w:val="left"/>
+      </w:pPr>
+      <w:r>
+        <w:rPr>
+          <w:rFonts w:ascii="TH Sarabun PSK" w:hAnsi="TH Sarabun PSK"/>
+          <w:b w:val="0"/>
+          <w:i w:val="0"/>
+          <w:color w:val="000000"/>
+          <w:sz w:val="32"/>
+        </w:rPr>
+        <w:t xml:space="preserve">1. </w:t>
+      </w:r>
+      <w:r>
+        <w:rPr>
+          <w:rFonts w:ascii="TH Sarabun PSK" w:hAnsi="TH Sarabun PSK"/>
+          <w:b/>
+          <w:color w:val="000000"/>
+          <w:sz w:val="32"/>
+        </w:rPr>
+        <w:t>ค่า Precision ต่ำโดยรวม</w:t>
+      </w:r>
+      <w:r>
+        <w:rPr>
+          <w:rFonts w:ascii="TH Sarabun PSK" w:hAnsi="TH Sarabun PSK"/>
+          <w:b w:val="0"/>
+          <w:i w:val="0"/>
+          <w:color w:val="000000"/>
+          <w:sz w:val="32"/>
+        </w:rPr>
+        <w:t xml:space="preserve"> — </w:t>
+      </w:r>
+      <w:r>
+        <w:rPr>
+          <w:rFonts w:ascii="Courier New" w:hAnsi="Courier New"/>
+          <w:color w:val="B42828"/>
+          <w:sz w:val="30"/>
+        </w:rPr>
+        <w:t>P@5 = 0.1221</w:t>
+      </w:r>
+      <w:r>
+        <w:rPr>
+          <w:rFonts w:ascii="TH Sarabun PSK" w:hAnsi="TH Sarabun PSK"/>
+          <w:b w:val="0"/>
+          <w:i w:val="0"/>
+          <w:color w:val="000000"/>
+          <w:sz w:val="32"/>
+        </w:rPr>
+        <w:t xml:space="preserve"> หมายความว่าในเอกสาร 5 อันดับแรก มีเอกสารที่ตรงเกณฑ์เฉลี่ยไม่ถึง 1 รายการ</w:t>
+      </w:r>
+    </w:p>
+    <w:p>
+      <w:pPr>
+        <w:spacing w:before="20" w:after="60" w:line="276" w:lineRule="auto"/>
+        <w:jc w:val="left"/>
+      </w:pPr>
+      <w:r>
+        <w:rPr>
+          <w:rFonts w:ascii="TH Sarabun PSK" w:hAnsi="TH Sarabun PSK"/>
+          <w:b w:val="0"/>
+          <w:i w:val="0"/>
+          <w:color w:val="000000"/>
+          <w:sz w:val="32"/>
+        </w:rPr>
+        <w:t xml:space="preserve">2. </w:t>
+      </w:r>
+      <w:r>
+        <w:rPr>
+          <w:rFonts w:ascii="TH Sarabun PSK" w:hAnsi="TH Sarabun PSK"/>
+          <w:b/>
+          <w:color w:val="000000"/>
+          <w:sz w:val="32"/>
+        </w:rPr>
+        <w:t>ส่วนเบี่ยงเบนมาตรฐานสูงกว่าค่าเฉลี่ย</w:t>
+      </w:r>
+      <w:r>
+        <w:rPr>
+          <w:rFonts w:ascii="TH Sarabun PSK" w:hAnsi="TH Sarabun PSK"/>
+          <w:b w:val="0"/>
+          <w:i w:val="0"/>
+          <w:color w:val="000000"/>
+          <w:sz w:val="32"/>
+        </w:rPr>
+        <w:t xml:space="preserve"> — </w:t>
+      </w:r>
+      <w:r>
+        <w:rPr>
+          <w:rFonts w:ascii="Courier New" w:hAnsi="Courier New"/>
+          <w:color w:val="B42828"/>
+          <w:sz w:val="30"/>
+        </w:rPr>
+        <w:t>P@5</w:t>
+      </w:r>
+      <w:r>
+        <w:rPr>
+          <w:rFonts w:ascii="TH Sarabun PSK" w:hAnsi="TH Sarabun PSK"/>
+          <w:b w:val="0"/>
+          <w:i w:val="0"/>
+          <w:color w:val="000000"/>
+          <w:sz w:val="32"/>
+        </w:rPr>
+        <w:t xml:space="preserve"> มี SD = 0.2110 เทียบกับ mean = 0.1221 สะท้อนว่ามีกรณีศึกษาจำนวนมากที่ได้ค่าศูนย์สนิท</w:t>
+      </w:r>
+    </w:p>
+    <w:p>
+      <w:pPr>
+        <w:spacing w:before="20" w:after="60" w:line="276" w:lineRule="auto"/>
+        <w:jc w:val="left"/>
+      </w:pPr>
+      <w:r>
+        <w:rPr>
+          <w:rFonts w:ascii="TH Sarabun PSK" w:hAnsi="TH Sarabun PSK"/>
+          <w:b w:val="0"/>
+          <w:i w:val="0"/>
+          <w:color w:val="000000"/>
+          <w:sz w:val="32"/>
+        </w:rPr>
+        <w:t xml:space="preserve">3. </w:t>
+      </w:r>
+      <w:r>
+        <w:rPr>
+          <w:rFonts w:ascii="TH Sarabun PSK" w:hAnsi="TH Sarabun PSK"/>
+          <w:b/>
+          <w:color w:val="000000"/>
+          <w:sz w:val="32"/>
+        </w:rPr>
+        <w:t>ค่ามัธยฐานของ nDCG@5 เท่ากับ 0.0000</w:t>
+      </w:r>
+      <w:r>
+        <w:rPr>
+          <w:rFonts w:ascii="TH Sarabun PSK" w:hAnsi="TH Sarabun PSK"/>
+          <w:b w:val="0"/>
+          <w:i w:val="0"/>
+          <w:color w:val="000000"/>
+          <w:sz w:val="32"/>
+        </w:rPr>
+        <w:t xml:space="preserve"> ทั้งที่ค่าเฉลี่ยอยู่ที่ 0.2485 แสดงว่าประสิทธิภาพกระจุกอยู่ในกรณีศึกษาส่วนน้อย</w:t>
+      </w:r>
+    </w:p>
+    <w:p>
+      <w:pPr>
+        <w:spacing w:before="20" w:after="60" w:line="276" w:lineRule="auto"/>
+        <w:jc w:val="left"/>
+      </w:pPr>
+      <w:r>
+        <w:rPr>
+          <w:rFonts w:ascii="TH Sarabun PSK" w:hAnsi="TH Sarabun PSK"/>
+          <w:b w:val="0"/>
+          <w:i w:val="0"/>
+          <w:color w:val="000000"/>
+          <w:sz w:val="32"/>
+        </w:rPr>
+        <w:t xml:space="preserve">4. </w:t>
+      </w:r>
+      <w:r>
+        <w:rPr>
+          <w:rFonts w:ascii="TH Sarabun PSK" w:hAnsi="TH Sarabun PSK"/>
+          <w:b/>
+          <w:color w:val="000000"/>
+          <w:sz w:val="32"/>
+        </w:rPr>
+        <w:t>ผลต่างรายกรณีเป็นศูนย์ในการทดสอบนัยสำคัญทุกคู่</w:t>
+      </w:r>
+      <w:r>
+        <w:rPr>
+          <w:rFonts w:ascii="TH Sarabun PSK" w:hAnsi="TH Sarabun PSK"/>
+          <w:b w:val="0"/>
+          <w:i w:val="0"/>
+          <w:color w:val="000000"/>
+          <w:sz w:val="32"/>
+        </w:rPr>
+        <w:t xml:space="preserve"> — ตารางที่ 4.4 แสดง median difference = 0 ในทุกคู่เปรียบเทียบ และมีกรณีที่ผลต่างไม่เป็นศูนย์เพียง 13–33 จาก 95 กรณีศึกษา</w:t>
+      </w:r>
+    </w:p>
+    <w:p>
+      <w:pPr>
+        <w:spacing w:before="160" w:after="60" w:line="276" w:lineRule="auto"/>
+        <w:jc w:val="left"/>
+      </w:pPr>
+      <w:r>
+        <w:rPr>
+          <w:rFonts w:ascii="TH Sarabun PSK" w:hAnsi="TH Sarabun PSK"/>
+          <w:b/>
+          <w:i w:val="0"/>
+          <w:color w:val="003366"/>
+          <w:sz w:val="32"/>
+        </w:rPr>
+        <w:t>4.9.2 การตีความผลที่ไม่มีนัยสำคัญทางสถิติ</w:t>
+      </w:r>
+    </w:p>
+    <w:p>
+      <w:pPr>
+        <w:spacing w:before="0" w:after="80" w:line="276" w:lineRule="auto"/>
+        <w:jc w:val="left"/>
+      </w:pPr>
+      <w:r>
+        <w:rPr>
+          <w:rFonts w:ascii="TH Sarabun PSK" w:hAnsi="TH Sarabun PSK"/>
+          <w:b w:val="0"/>
+          <w:i w:val="0"/>
+          <w:color w:val="000000"/>
+          <w:sz w:val="32"/>
+        </w:rPr>
+        <w:t xml:space="preserve">จากข้อจำกัดข้างต้น ผลที่ไม่มีนัยสำคัญในบทนี้ </w:t>
+      </w:r>
+      <w:r>
+        <w:rPr>
+          <w:rFonts w:ascii="TH Sarabun PSK" w:hAnsi="TH Sarabun PSK"/>
+          <w:b/>
+          <w:color w:val="000000"/>
+          <w:sz w:val="32"/>
+        </w:rPr>
+        <w:t>ไม่ควรตีความว่ากลไกที่เกี่ยวข้องไม่ทำงาน</w:t>
+      </w:r>
+      <w:r>
+        <w:rPr>
+          <w:rFonts w:ascii="TH Sarabun PSK" w:hAnsi="TH Sarabun PSK"/>
+          <w:b w:val="0"/>
+          <w:i w:val="0"/>
+          <w:color w:val="000000"/>
+          <w:sz w:val="32"/>
+        </w:rPr>
+        <w:t xml:space="preserve"> เนื่องจากการทดลองแต่ละรายการมีหลักฐานยืนยันว่ากลไกถูกกระตุ้นจริง (manipulation check) แยกจากผลลัพธ์ปลายทาง</w:t>
+      </w:r>
+    </w:p>
+    <w:tbl>
+      <w:tblPr>
+        <w:tblW w:type="auto" w:w="0"/>
+        <w:jc w:val="center"/>
+        <w:tblLook w:firstColumn="1" w:firstRow="1" w:lastColumn="0" w:lastRow="0" w:noHBand="0" w:noVBand="1" w:val="04A0"/>
+      </w:tblPr>
+      <w:tblGrid>
+        <w:gridCol w:w="2880"/>
+        <w:gridCol w:w="2880"/>
+        <w:gridCol w:w="2880"/>
+      </w:tblGrid>
+      <w:tr>
+        <w:tc>
+          <w:tcPr>
+            <w:tcW w:type="dxa" w:w="2880"/>
+            <w:shd w:fill="F0F4F8"/>
+            <w:tcMar>
+              <w:top w:w="100" w:type="dxa"/>
+              <w:bottom w:w="100" w:type="dxa"/>
+              <w:left w:w="120" w:type="dxa"/>
+              <w:right w:w="120" w:type="dxa"/>
+            </w:tcMar>
+          </w:tcPr>
+          <w:p>
+            <w:pPr>
+              <w:jc w:val="center"/>
+            </w:pPr>
+            <w:r>
+              <w:rPr>
+                <w:rFonts w:ascii="TH Sarabun PSK" w:hAnsi="TH Sarabun PSK"/>
+                <w:b/>
+                <w:color w:val="003366"/>
+                <w:sz w:val="28"/>
+              </w:rPr>
+              <w:t>การทดลอง</w:t>
+            </w:r>
+          </w:p>
+        </w:tc>
+        <w:tc>
+          <w:tcPr>
+            <w:tcW w:type="dxa" w:w="2880"/>
+            <w:shd w:fill="F0F4F8"/>
+            <w:tcMar>
+              <w:top w:w="100" w:type="dxa"/>
+              <w:bottom w:w="100" w:type="dxa"/>
+              <w:left w:w="120" w:type="dxa"/>
+              <w:right w:w="120" w:type="dxa"/>
+            </w:tcMar>
+          </w:tcPr>
+          <w:p>
+            <w:pPr>
+              <w:jc w:val="center"/>
+            </w:pPr>
+            <w:r>
+              <w:rPr>
+                <w:rFonts w:ascii="TH Sarabun PSK" w:hAnsi="TH Sarabun PSK"/>
+                <w:b/>
+                <w:color w:val="003366"/>
+                <w:sz w:val="28"/>
+              </w:rPr>
+              <w:t>หลักฐานว่ากลไกทำงาน</w:t>
+            </w:r>
+          </w:p>
+        </w:tc>
+        <w:tc>
+          <w:tcPr>
+            <w:tcW w:type="dxa" w:w="2880"/>
+            <w:shd w:fill="F0F4F8"/>
+            <w:tcMar>
+              <w:top w:w="100" w:type="dxa"/>
+              <w:bottom w:w="100" w:type="dxa"/>
+              <w:left w:w="120" w:type="dxa"/>
+              <w:right w:w="120" w:type="dxa"/>
+            </w:tcMar>
+          </w:tcPr>
+          <w:p>
+            <w:pPr>
+              <w:jc w:val="center"/>
+            </w:pPr>
+            <w:r>
+              <w:rPr>
+                <w:rFonts w:ascii="TH Sarabun PSK" w:hAnsi="TH Sarabun PSK"/>
+                <w:b/>
+                <w:color w:val="003366"/>
+                <w:sz w:val="28"/>
+              </w:rPr>
+              <w:t>ผลต่อการจัดอันดับ</w:t>
+            </w:r>
+          </w:p>
+        </w:tc>
+      </w:tr>
+      <w:tr>
+        <w:tc>
+          <w:tcPr>
+            <w:tcW w:type="dxa" w:w="2880"/>
+            <w:shd w:fill="FFFFFF"/>
+            <w:tcMar>
+              <w:top w:w="80" w:type="dxa"/>
+              <w:bottom w:w="80" w:type="dxa"/>
+              <w:left w:w="100" w:type="dxa"/>
+              <w:right w:w="100" w:type="dxa"/>
+            </w:tcMar>
+          </w:tcPr>
+          <w:p>
+            <w:pPr>
+              <w:jc w:val="left"/>
+            </w:pPr>
+            <w:r>
+              <w:rPr>
+                <w:rFonts w:ascii="TH Sarabun PSK" w:hAnsi="TH Sarabun PSK"/>
+                <w:sz w:val="26"/>
+              </w:rPr>
+              <w:t>L2 Filtering (ตารางที่ 4.7)</w:t>
+            </w:r>
+          </w:p>
+        </w:tc>
+        <w:tc>
+          <w:tcPr>
+            <w:tcW w:type="dxa" w:w="2880"/>
+            <w:shd w:fill="FFFFFF"/>
+            <w:tcMar>
+              <w:top w:w="80" w:type="dxa"/>
+              <w:bottom w:w="80" w:type="dxa"/>
+              <w:left w:w="100" w:type="dxa"/>
+              <w:right w:w="100" w:type="dxa"/>
+            </w:tcMar>
+          </w:tcPr>
+          <w:p>
+            <w:pPr>
+              <w:jc w:val="center"/>
+            </w:pPr>
+            <w:r>
+              <w:rPr>
+                <w:rFonts w:ascii="TH Sarabun PSK" w:hAnsi="TH Sarabun PSK"/>
+                <w:sz w:val="26"/>
+              </w:rPr>
+              <w:t>รายการปัญหาที่ตรวจพบต่างกัน 7 จาก 95 กรณี</w:t>
+            </w:r>
+          </w:p>
+        </w:tc>
+        <w:tc>
+          <w:tcPr>
+            <w:tcW w:type="dxa" w:w="2880"/>
+            <w:shd w:fill="FFFFFF"/>
+            <w:tcMar>
+              <w:top w:w="80" w:type="dxa"/>
+              <w:bottom w:w="80" w:type="dxa"/>
+              <w:left w:w="100" w:type="dxa"/>
+              <w:right w:w="100" w:type="dxa"/>
+            </w:tcMar>
+          </w:tcPr>
+          <w:p>
+            <w:pPr>
+              <w:jc w:val="center"/>
+            </w:pPr>
+            <w:r>
+              <w:rPr>
+                <w:rFonts w:ascii="TH Sarabun PSK" w:hAnsi="TH Sarabun PSK"/>
+                <w:sz w:val="26"/>
+              </w:rPr>
+              <w:t>ไม่มีนัยสำคัญ ($p = 0.317$)</w:t>
+            </w:r>
+          </w:p>
+        </w:tc>
+      </w:tr>
+      <w:tr>
+        <w:tc>
+          <w:tcPr>
+            <w:tcW w:type="dxa" w:w="2880"/>
+            <w:shd w:fill="FAFAFA"/>
+            <w:tcMar>
+              <w:top w:w="80" w:type="dxa"/>
+              <w:bottom w:w="80" w:type="dxa"/>
+              <w:left w:w="100" w:type="dxa"/>
+              <w:right w:w="100" w:type="dxa"/>
+            </w:tcMar>
+          </w:tcPr>
+          <w:p>
+            <w:pPr>
+              <w:jc w:val="left"/>
+            </w:pPr>
+            <w:r>
+              <w:rPr>
+                <w:rFonts w:ascii="TH Sarabun PSK" w:hAnsi="TH Sarabun PSK"/>
+                <w:sz w:val="26"/>
+              </w:rPr>
+              <w:t>Component Ablation (ตารางที่ 4.6)</w:t>
+            </w:r>
+          </w:p>
+        </w:tc>
+        <w:tc>
+          <w:tcPr>
+            <w:tcW w:type="dxa" w:w="2880"/>
+            <w:shd w:fill="FAFAFA"/>
+            <w:tcMar>
+              <w:top w:w="80" w:type="dxa"/>
+              <w:bottom w:w="80" w:type="dxa"/>
+              <w:left w:w="100" w:type="dxa"/>
+              <w:right w:w="100" w:type="dxa"/>
+            </w:tcMar>
+          </w:tcPr>
+          <w:p>
+            <w:pPr>
+              <w:jc w:val="center"/>
+            </w:pPr>
+            <w:r>
+              <w:rPr>
+                <w:rFonts w:ascii="TH Sarabun PSK" w:hAnsi="TH Sarabun PSK"/>
+                <w:sz w:val="26"/>
+              </w:rPr>
+              <w:t>คะแนน H2L เปลี่ยนใน 45–90 จาก 95 กรณี ตามองค์ประกอบที่ปิด</w:t>
+            </w:r>
+          </w:p>
+        </w:tc>
+        <w:tc>
+          <w:tcPr>
+            <w:tcW w:type="dxa" w:w="2880"/>
+            <w:shd w:fill="FAFAFA"/>
+            <w:tcMar>
+              <w:top w:w="80" w:type="dxa"/>
+              <w:bottom w:w="80" w:type="dxa"/>
+              <w:left w:w="100" w:type="dxa"/>
+              <w:right w:w="100" w:type="dxa"/>
+            </w:tcMar>
+          </w:tcPr>
+          <w:p>
+            <w:pPr>
+              <w:jc w:val="center"/>
+            </w:pPr>
+            <w:r>
+              <w:rPr>
+                <w:rFonts w:ascii="TH Sarabun PSK" w:hAnsi="TH Sarabun PSK"/>
+                <w:sz w:val="26"/>
+              </w:rPr>
+              <w:t>ไม่มีนัยสำคัญ (Holm $p = 1.0000$ ทุกคู่)</w:t>
+            </w:r>
+          </w:p>
+        </w:tc>
+      </w:tr>
+    </w:tbl>
+    <w:p>
+      <w:pPr>
+        <w:spacing w:before="0" w:after="80" w:line="276" w:lineRule="auto"/>
+        <w:jc w:val="left"/>
+      </w:pPr>
+      <w:r>
+        <w:rPr>
+          <w:rFonts w:ascii="TH Sarabun PSK" w:hAnsi="TH Sarabun PSK"/>
+          <w:b w:val="0"/>
+          <w:i w:val="0"/>
+          <w:color w:val="000000"/>
+          <w:sz w:val="32"/>
+        </w:rPr>
+        <w:t>ในกรณีของ Component Ablation การที่คะแนนภายในเปลี่ยนแปลงในกรณีศึกษาส่วนใหญ่ แต่สัดส่วนกรณีที่ลำดับเอกสารเปลี่ยนอยู่ที่เพียง 1.1–4.2% ยืนยันว่าองค์ประกอบทั้งหมดถูกคำนวณจริง หากแต่ขนาดของการเปลี่ยนแปลงยังไม่มากพอที่จะสลับลำดับเอกสารภายในคลังขนาด 92 รายการ</w:t>
+      </w:r>
+    </w:p>
+    <w:p>
+      <w:pPr>
+        <w:spacing w:before="160" w:after="60" w:line="276" w:lineRule="auto"/>
+        <w:jc w:val="left"/>
+      </w:pPr>
+      <w:r>
+        <w:rPr>
+          <w:rFonts w:ascii="TH Sarabun PSK" w:hAnsi="TH Sarabun PSK"/>
+          <w:b/>
+          <w:i w:val="0"/>
+          <w:color w:val="003366"/>
+          <w:sz w:val="32"/>
+        </w:rPr>
+        <w:t>4.9.3 ข้อจำกัดด้านขนาดตัวอย่างในการประเมินย่อย</w:t>
+      </w:r>
+    </w:p>
+    <w:p>
+      <w:pPr>
+        <w:spacing w:before="0" w:after="80" w:line="276" w:lineRule="auto"/>
+        <w:jc w:val="left"/>
+      </w:pPr>
+      <w:r>
+        <w:rPr>
+          <w:rFonts w:ascii="TH Sarabun PSK" w:hAnsi="TH Sarabun PSK"/>
+          <w:b w:val="0"/>
+          <w:i w:val="0"/>
+          <w:color w:val="000000"/>
+          <w:sz w:val="32"/>
+        </w:rPr>
+        <w:t xml:space="preserve">การประเมิน Contextual Polarity Gate ในหัวข้อ 4.2 อาศัยกรณีศึกษาที่มีประโยคปฏิเสธจำนวน </w:t>
+      </w:r>
+      <w:r>
+        <w:rPr>
+          <w:rFonts w:ascii="TH Sarabun PSK" w:hAnsi="TH Sarabun PSK"/>
+          <w:b/>
+          <w:color w:val="000000"/>
+          <w:sz w:val="32"/>
+        </w:rPr>
+        <w:t>18 กรณี</w:t>
+      </w:r>
+      <w:r>
+        <w:rPr>
+          <w:rFonts w:ascii="TH Sarabun PSK" w:hAnsi="TH Sarabun PSK"/>
+          <w:b w:val="0"/>
+          <w:i w:val="0"/>
+          <w:color w:val="000000"/>
+          <w:sz w:val="32"/>
+        </w:rPr>
+        <w:t xml:space="preserve"> ค่า Negation Detection Rate ที่ 72.22% จึงมีช่วงความเชื่อมั่นกว้าง และการจำแนกตามความยาวข้อความ (สั้น 6 กรณี ปานกลาง 6 กรณี ยาว 6 กรณี) มีขนาดตัวอย่างต่อกลุ่มน้อยเกินกว่าจะสรุปแนวโน้มตามความยาวได้อย่างมั่นใจ ควรถือเป็นข้อสังเกตเชิงพรรณนา ไม่ใช่ข้อสรุปเชิงอนุมาน</w:t>
+      </w:r>
+    </w:p>
+    <w:p>
+      <w:pPr>
+        <w:spacing w:before="0" w:after="80" w:line="276" w:lineRule="auto"/>
+        <w:jc w:val="left"/>
+      </w:pPr>
+      <w:r>
+        <w:rPr>
+          <w:rFonts w:ascii="TH Sarabun PSK" w:hAnsi="TH Sarabun PSK"/>
+          <w:b w:val="0"/>
+          <w:i w:val="0"/>
+          <w:color w:val="000000"/>
+          <w:sz w:val="32"/>
+        </w:rPr>
+        <w:t>ในทำนองเดียวกัน ชุดกรณีศึกษาท้าทายในหัวข้อ 4.6 มี 20 กรณี ค่า false-trigger suppression ที่ 15.00% และ joint pass ที่ 10.00% จึงมาจากกรณีที่ผ่านเกณฑ์เพียง 2 กรณี ผลนี้เพียงพอที่จะระบุ failure mode ของระบบได้ แต่ยังไม่เพียงพอที่จะประมาณอัตราความผิดพลาดในการใช้งานจริง</w:t>
+      </w:r>
+    </w:p>
+    <w:p>
+      <w:pPr>
+        <w:spacing w:before="160" w:after="60" w:line="276" w:lineRule="auto"/>
+        <w:jc w:val="left"/>
+      </w:pPr>
+      <w:r>
+        <w:rPr>
+          <w:rFonts w:ascii="TH Sarabun PSK" w:hAnsi="TH Sarabun PSK"/>
+          <w:b/>
+          <w:i w:val="0"/>
+          <w:color w:val="003366"/>
+          <w:sz w:val="32"/>
+        </w:rPr>
+        <w:t>4.9.4 ขอบเขตที่การทดลองนี้ยังไม่ครอบคลุม</w:t>
+      </w:r>
+    </w:p>
+    <w:p>
+      <w:pPr>
+        <w:spacing w:before="20" w:after="60" w:line="276" w:lineRule="auto"/>
+        <w:jc w:val="left"/>
+      </w:pPr>
+      <w:r>
+        <w:rPr>
+          <w:rFonts w:ascii="TH Sarabun PSK" w:hAnsi="TH Sarabun PSK"/>
+          <w:b w:val="0"/>
+          <w:i w:val="0"/>
+          <w:color w:val="000000"/>
+          <w:sz w:val="32"/>
+        </w:rPr>
+        <w:t xml:space="preserve">1. </w:t>
+      </w:r>
+      <w:r>
+        <w:rPr>
+          <w:rFonts w:ascii="TH Sarabun PSK" w:hAnsi="TH Sarabun PSK"/>
+          <w:b/>
+          <w:color w:val="000000"/>
+          <w:sz w:val="32"/>
+        </w:rPr>
+        <w:t>การแยกผลของ Bayesian Prior</w:t>
+      </w:r>
+      <w:r>
+        <w:rPr>
+          <w:rFonts w:ascii="TH Sarabun PSK" w:hAnsi="TH Sarabun PSK"/>
+          <w:b w:val="0"/>
+          <w:i w:val="0"/>
+          <w:color w:val="000000"/>
+          <w:sz w:val="32"/>
+        </w:rPr>
+        <w:t xml:space="preserve"> — การทดลองที่ออกแบบไว้เพื่อเปรียบเทียบ severity-weighted prior กับ uniform prior ให้ผลลัพธ์ตรงกับการทดลองเปิด/ปิดชั้น H2L ทุกกรณีศึกษาและทุกตัวชี้วัด เนื่องจากการตั้งค่าดังกล่าวปิด semantic contribution ทั้งหมดพร้อมกัน ไม่ได้แยกปิดเฉพาะการถ่วงน้ำหนักตามความรุนแรง จึงยังไม่มีหลักฐานเชิงประจักษ์แยกส่วนสำหรับองค์ประกอบนี้</w:t>
+      </w:r>
+    </w:p>
+    <w:p>
+      <w:pPr>
+        <w:spacing w:before="20" w:after="60" w:line="276" w:lineRule="auto"/>
+        <w:jc w:val="left"/>
+      </w:pPr>
+      <w:r>
+        <w:rPr>
+          <w:rFonts w:ascii="TH Sarabun PSK" w:hAnsi="TH Sarabun PSK"/>
+          <w:b w:val="0"/>
+          <w:i w:val="0"/>
+          <w:color w:val="000000"/>
+          <w:sz w:val="32"/>
+        </w:rPr>
+        <w:t xml:space="preserve">2. </w:t>
+      </w:r>
+      <w:r>
+        <w:rPr>
+          <w:rFonts w:ascii="TH Sarabun PSK" w:hAnsi="TH Sarabun PSK"/>
+          <w:b/>
+          <w:color w:val="000000"/>
+          <w:sz w:val="32"/>
+        </w:rPr>
+        <w:t>ความเป็นสากลข้ามสถาปัตยกรรมการค้นคืน</w:t>
+      </w:r>
+      <w:r>
+        <w:rPr>
+          <w:rFonts w:ascii="TH Sarabun PSK" w:hAnsi="TH Sarabun PSK"/>
+          <w:b w:val="0"/>
+          <w:i w:val="0"/>
+          <w:color w:val="000000"/>
+          <w:sz w:val="32"/>
+        </w:rPr>
+        <w:t xml:space="preserve"> — ตารางที่ 4.3 แสดงว่า H2L ยกระดับกลยุทธ์ฝั่ง sparse retrieval (</w:t>
+      </w:r>
+      <w:r>
+        <w:rPr>
+          <w:rFonts w:ascii="Courier New" w:hAnsi="Courier New"/>
+          <w:color w:val="B42828"/>
+          <w:sz w:val="30"/>
+        </w:rPr>
+        <w:t>bm25_only</w:t>
+      </w:r>
+      <w:r>
+        <w:rPr>
+          <w:rFonts w:ascii="TH Sarabun PSK" w:hAnsi="TH Sarabun PSK"/>
+          <w:b w:val="0"/>
+          <w:i w:val="0"/>
+          <w:color w:val="000000"/>
+          <w:sz w:val="32"/>
+        </w:rPr>
+        <w:t xml:space="preserve"> 0.2221 → 0.2369 และ </w:t>
+      </w:r>
+      <w:r>
+        <w:rPr>
+          <w:rFonts w:ascii="Courier New" w:hAnsi="Courier New"/>
+          <w:color w:val="B42828"/>
+          <w:sz w:val="30"/>
+        </w:rPr>
+        <w:t>basic</w:t>
+      </w:r>
+      <w:r>
+        <w:rPr>
+          <w:rFonts w:ascii="TH Sarabun PSK" w:hAnsi="TH Sarabun PSK"/>
+          <w:b w:val="0"/>
+          <w:i w:val="0"/>
+          <w:color w:val="000000"/>
+          <w:sz w:val="32"/>
+        </w:rPr>
+        <w:t xml:space="preserve"> 0.2351 → 0.2485 ในค่า nDCG@5) แต่ไม่ยกระดับฝั่ง dense retrieval (</w:t>
+      </w:r>
+      <w:r>
+        <w:rPr>
+          <w:rFonts w:ascii="Courier New" w:hAnsi="Courier New"/>
+          <w:color w:val="B42828"/>
+          <w:sz w:val="30"/>
+        </w:rPr>
+        <w:t>naive_rag</w:t>
+      </w:r>
+      <w:r>
+        <w:rPr>
+          <w:rFonts w:ascii="TH Sarabun PSK" w:hAnsi="TH Sarabun PSK"/>
+          <w:b w:val="0"/>
+          <w:i w:val="0"/>
+          <w:color w:val="000000"/>
+          <w:sz w:val="32"/>
+        </w:rPr>
+        <w:t xml:space="preserve"> 0.2019 → 0.2017 และ </w:t>
+      </w:r>
+      <w:r>
+        <w:rPr>
+          <w:rFonts w:ascii="Courier New" w:hAnsi="Courier New"/>
+          <w:color w:val="B42828"/>
+          <w:sz w:val="30"/>
+        </w:rPr>
+        <w:t>hyde</w:t>
+      </w:r>
+      <w:r>
+        <w:rPr>
+          <w:rFonts w:ascii="TH Sarabun PSK" w:hAnsi="TH Sarabun PSK"/>
+          <w:b w:val="0"/>
+          <w:i w:val="0"/>
+          <w:color w:val="000000"/>
+          <w:sz w:val="32"/>
+        </w:rPr>
+        <w:t xml:space="preserve"> 0.0732 → 0.0722) ข้อสังเกตนี้มาจากการเปรียบเทียบค่าเฉลี่ย ยังไม่ได้ผ่านการทดสอบนัยสำคัญแบบจับคู่รายกรณีในทุกคู่</w:t>
+      </w:r>
+    </w:p>
+    <w:p>
+      <w:pPr>
+        <w:spacing w:before="20" w:after="60" w:line="276" w:lineRule="auto"/>
+        <w:jc w:val="left"/>
+      </w:pPr>
+      <w:r>
+        <w:rPr>
+          <w:rFonts w:ascii="TH Sarabun PSK" w:hAnsi="TH Sarabun PSK"/>
+          <w:b w:val="0"/>
+          <w:i w:val="0"/>
+          <w:color w:val="000000"/>
+          <w:sz w:val="32"/>
+        </w:rPr>
+        <w:t xml:space="preserve">3. </w:t>
+      </w:r>
+      <w:r>
+        <w:rPr>
+          <w:rFonts w:ascii="TH Sarabun PSK" w:hAnsi="TH Sarabun PSK"/>
+          <w:b/>
+          <w:color w:val="000000"/>
+          <w:sz w:val="32"/>
+        </w:rPr>
+        <w:t>ความไวของ $\alpha$ ภายใต้ adaptive scaling</w:t>
+      </w:r>
+      <w:r>
+        <w:rPr>
+          <w:rFonts w:ascii="TH Sarabun PSK" w:hAnsi="TH Sarabun PSK"/>
+          <w:b w:val="0"/>
+          <w:i w:val="0"/>
+          <w:color w:val="000000"/>
+          <w:sz w:val="32"/>
+        </w:rPr>
+        <w:t xml:space="preserve"> — การกวาดค่า $\alpha_0$ ดำเนินการโดยเปิด adaptive $\alpha$ ตามค่าตั้งต้นของระบบ ซึ่งปรับสเกล $\alpha$ ใหม่ตามจำนวนปัญหาและค่าความเชื่อมั่น ผลที่ได้จึงเป็นความไวของระบบโดยรวม ไม่ใช่ความไวของ $\alpha_0$ โดยลำพัง</w:t>
+      </w:r>
+    </w:p>
+    <w:p>
+      <w:pPr>
+        <w:spacing w:before="160" w:after="60" w:line="276" w:lineRule="auto"/>
+        <w:jc w:val="left"/>
+      </w:pPr>
+      <w:r>
+        <w:rPr>
+          <w:rFonts w:ascii="TH Sarabun PSK" w:hAnsi="TH Sarabun PSK"/>
+          <w:b/>
+          <w:i w:val="0"/>
+          <w:color w:val="003366"/>
+          <w:sz w:val="32"/>
+        </w:rPr>
+        <w:t>4.9.5 นัยต่อการพัฒนาต่อ</w:t>
+      </w:r>
+    </w:p>
+    <w:p>
+      <w:pPr>
+        <w:spacing w:before="0" w:after="80" w:line="276" w:lineRule="auto"/>
+        <w:jc w:val="left"/>
+      </w:pPr>
+      <w:r>
+        <w:rPr>
+          <w:rFonts w:ascii="TH Sarabun PSK" w:hAnsi="TH Sarabun PSK"/>
+          <w:b w:val="0"/>
+          <w:i w:val="0"/>
+          <w:color w:val="000000"/>
+          <w:sz w:val="32"/>
+        </w:rPr>
+        <w:t>ข้อจำกัดหลักในหัวข้อ 4.9.1 เป็นข้อจำกัดของทรัพยากรข้อมูล ไม่ใช่ข้อจำกัดของกรอบแนวคิด การขยายคลังเอกสารอ้างอิงให้ครอบคลุมคู่มือแนวปฏิบัติและเอกสารสิทธิประโยชน์ในสัดส่วนที่มากขึ้น จะลดสัดส่วนการดึงเอกสารต่อ query ลงจาก 16.3% และเปิดพื้นที่ให้กลไกการจัดอันดับแสดงผลต่างที่วัดได้ การทดลองซ้ำบนคลังที่ใหญ่ขึ้นจึงเป็นเงื่อนไขจำเป็นก่อนที่จะสรุปว่าองค์ประกอบใดในสถาปัตยกรรม H2L มีส่วนช่วยหรือไม่มีส่วนช่วยต่อคุณภาพการจัดอันดับ</w:t>
       </w:r>
     </w:p>
     <w:sectPr>

</xml_diff>

<commit_message>
feat(ch4): expand Table 4.4 significance to 4 metrics (nDCG@5/@10/MAP/MRR)
Previous Table 4.4 only reported nDCG@5 and nDCG@10.  Now shows 4-metric
Holm-Bonferroni matrix (7 pairs × 4 metrics, each metric a separate family).

Key findings added:
- naive_rag: significant for nDCG@5/nDCG@10/MAP, borderline MRR (Holm p=0.057)
- hyde / h2l-hyde: significant across all 4 metrics
- h2l-naive_rag: significant for nDCG@5/nDCG@10/MAP, not MRR (Holm p=0.410)
- bm25_only, basic, h2l-bm25: not significant in any metric

Summary sentence updated: 'H2L benefits concentrate on weak dense retrieval,
not sparse/hybrid baselines that already carry keyword power.'

184 tests pass.

Co-Authored-By: Claude Opus 5 (1M context) <noreply@anthropic.com>
</commit_message>
<xml_diff>
--- a/ch4_thesis.docx
+++ b/ch4_thesis.docx
@@ -3830,7 +3830,7 @@
           <w:color w:val="000000"/>
           <w:sz w:val="32"/>
         </w:rPr>
-        <w:t>ตารางที่ 4.4 ผลการทดสอบนัยสำคัญทางสถิติแบบคู่ (n=95 กรณีศึกษา, Holm-Bonferroni Correction)</w:t>
+        <w:t>ตารางที่ 4.4 ผลการทดสอบนัยสำคัญทางสถิติแบบคู่ — Holm-Bonferroni (n=95 กรณีศึกษา, 4 ตัวชี้วัด)</w:t>
       </w:r>
     </w:p>
     <w:tbl>
@@ -3840,19 +3840,20 @@
         <w:tblLook w:firstColumn="1" w:firstRow="1" w:lastColumn="0" w:lastRow="0" w:noHBand="0" w:noVBand="1" w:val="04A0"/>
       </w:tblPr>
       <w:tblGrid>
-        <w:gridCol w:w="1080"/>
-        <w:gridCol w:w="1080"/>
-        <w:gridCol w:w="1080"/>
-        <w:gridCol w:w="1080"/>
-        <w:gridCol w:w="1080"/>
-        <w:gridCol w:w="1080"/>
-        <w:gridCol w:w="1080"/>
-        <w:gridCol w:w="1080"/>
+        <w:gridCol w:w="960"/>
+        <w:gridCol w:w="960"/>
+        <w:gridCol w:w="960"/>
+        <w:gridCol w:w="960"/>
+        <w:gridCol w:w="960"/>
+        <w:gridCol w:w="960"/>
+        <w:gridCol w:w="960"/>
+        <w:gridCol w:w="960"/>
+        <w:gridCol w:w="960"/>
       </w:tblGrid>
       <w:tr>
         <w:tc>
           <w:tcPr>
-            <w:tcW w:type="dxa" w:w="1080"/>
+            <w:tcW w:type="dxa" w:w="960"/>
             <w:shd w:fill="F0F4F8"/>
             <w:tcMar>
               <w:top w:w="100" w:type="dxa"/>
@@ -3878,7 +3879,7 @@
         </w:tc>
         <w:tc>
           <w:tcPr>
-            <w:tcW w:type="dxa" w:w="1080"/>
+            <w:tcW w:type="dxa" w:w="960"/>
             <w:shd w:fill="F0F4F8"/>
             <w:tcMar>
               <w:top w:w="100" w:type="dxa"/>
@@ -3898,13 +3899,13 @@
                 <w:color w:val="003366"/>
                 <w:sz w:val="28"/>
               </w:rPr>
-              <w:t>ตัวชี้วัด</w:t>
-            </w:r>
-          </w:p>
-        </w:tc>
-        <w:tc>
-          <w:tcPr>
-            <w:tcW w:type="dxa" w:w="1080"/>
+              <w:t>Δ nDCG@5</w:t>
+            </w:r>
+          </w:p>
+        </w:tc>
+        <w:tc>
+          <w:tcPr>
+            <w:tcW w:type="dxa" w:w="960"/>
             <w:shd w:fill="F0F4F8"/>
             <w:tcMar>
               <w:top w:w="100" w:type="dxa"/>
@@ -3924,13 +3925,13 @@
                 <w:color w:val="003366"/>
                 <w:sz w:val="28"/>
               </w:rPr>
-              <w:t>Baseline</w:t>
-            </w:r>
-          </w:p>
-        </w:tc>
-        <w:tc>
-          <w:tcPr>
-            <w:tcW w:type="dxa" w:w="1080"/>
+              <w:t>Holm (nDCG@5)</w:t>
+            </w:r>
+          </w:p>
+        </w:tc>
+        <w:tc>
+          <w:tcPr>
+            <w:tcW w:type="dxa" w:w="960"/>
             <w:shd w:fill="F0F4F8"/>
             <w:tcMar>
               <w:top w:w="100" w:type="dxa"/>
@@ -3950,13 +3951,13 @@
                 <w:color w:val="003366"/>
                 <w:sz w:val="28"/>
               </w:rPr>
-              <w:t>H2L</w:t>
-            </w:r>
-          </w:p>
-        </w:tc>
-        <w:tc>
-          <w:tcPr>
-            <w:tcW w:type="dxa" w:w="1080"/>
+              <w:t>Δ nDCG@10</w:t>
+            </w:r>
+          </w:p>
+        </w:tc>
+        <w:tc>
+          <w:tcPr>
+            <w:tcW w:type="dxa" w:w="960"/>
             <w:shd w:fill="F0F4F8"/>
             <w:tcMar>
               <w:top w:w="100" w:type="dxa"/>
@@ -3976,13 +3977,13 @@
                 <w:color w:val="003366"/>
                 <w:sz w:val="28"/>
               </w:rPr>
-              <w:t>$\Delta$</w:t>
-            </w:r>
-          </w:p>
-        </w:tc>
-        <w:tc>
-          <w:tcPr>
-            <w:tcW w:type="dxa" w:w="1080"/>
+              <w:t>Holm (nDCG@10)</w:t>
+            </w:r>
+          </w:p>
+        </w:tc>
+        <w:tc>
+          <w:tcPr>
+            <w:tcW w:type="dxa" w:w="960"/>
             <w:shd w:fill="F0F4F8"/>
             <w:tcMar>
               <w:top w:w="100" w:type="dxa"/>
@@ -4002,13 +4003,13 @@
                 <w:color w:val="003366"/>
                 <w:sz w:val="28"/>
               </w:rPr>
-              <w:t>Raw $p$</w:t>
-            </w:r>
-          </w:p>
-        </w:tc>
-        <w:tc>
-          <w:tcPr>
-            <w:tcW w:type="dxa" w:w="1080"/>
+              <w:t>Δ MAP</w:t>
+            </w:r>
+          </w:p>
+        </w:tc>
+        <w:tc>
+          <w:tcPr>
+            <w:tcW w:type="dxa" w:w="960"/>
             <w:shd w:fill="F0F4F8"/>
             <w:tcMar>
               <w:top w:w="100" w:type="dxa"/>
@@ -4028,13 +4029,13 @@
                 <w:color w:val="003366"/>
                 <w:sz w:val="28"/>
               </w:rPr>
-              <w:t>Holm $p$</w:t>
-            </w:r>
-          </w:p>
-        </w:tc>
-        <w:tc>
-          <w:tcPr>
-            <w:tcW w:type="dxa" w:w="1080"/>
+              <w:t>Holm (MAP)</w:t>
+            </w:r>
+          </w:p>
+        </w:tc>
+        <w:tc>
+          <w:tcPr>
+            <w:tcW w:type="dxa" w:w="960"/>
             <w:shd w:fill="F0F4F8"/>
             <w:tcMar>
               <w:top w:w="100" w:type="dxa"/>
@@ -4054,7 +4055,33 @@
                 <w:color w:val="003366"/>
                 <w:sz w:val="28"/>
               </w:rPr>
-              <w:t>ข้อสรุป</w:t>
+              <w:t>Δ MRR</w:t>
+            </w:r>
+          </w:p>
+        </w:tc>
+        <w:tc>
+          <w:tcPr>
+            <w:tcW w:type="dxa" w:w="960"/>
+            <w:shd w:fill="F0F4F8"/>
+            <w:tcMar>
+              <w:top w:w="100" w:type="dxa"/>
+              <w:bottom w:w="100" w:type="dxa"/>
+              <w:left w:w="120" w:type="dxa"/>
+              <w:right w:w="120" w:type="dxa"/>
+            </w:tcMar>
+          </w:tcPr>
+          <w:p>
+            <w:pPr>
+              <w:jc w:val="center"/>
+            </w:pPr>
+            <w:r>
+              <w:rPr>
+                <w:rFonts w:ascii="TH Sarabun PSK" w:hAnsi="TH Sarabun PSK"/>
+                <w:b/>
+                <w:color w:val="003366"/>
+                <w:sz w:val="28"/>
+              </w:rPr>
+              <w:t>Holm (MRR)</w:t>
             </w:r>
           </w:p>
         </w:tc>
@@ -4062,7 +4089,7 @@
       <w:tr>
         <w:tc>
           <w:tcPr>
-            <w:tcW w:type="dxa" w:w="1080"/>
+            <w:tcW w:type="dxa" w:w="960"/>
             <w:shd w:fill="FFFFFF"/>
             <w:tcMar>
               <w:top w:w="80" w:type="dxa"/>
@@ -4086,7 +4113,7 @@
         </w:tc>
         <w:tc>
           <w:tcPr>
-            <w:tcW w:type="dxa" w:w="1080"/>
+            <w:tcW w:type="dxa" w:w="960"/>
             <w:shd w:fill="FFFFFF"/>
             <w:tcMar>
               <w:top w:w="80" w:type="dxa"/>
@@ -4104,13 +4131,13 @@
                 <w:rFonts w:ascii="TH Sarabun PSK" w:hAnsi="TH Sarabun PSK"/>
                 <w:sz w:val="26"/>
               </w:rPr>
-              <w:t>nDCG@5</w:t>
-            </w:r>
-          </w:p>
-        </w:tc>
-        <w:tc>
-          <w:tcPr>
-            <w:tcW w:type="dxa" w:w="1080"/>
+              <w:t>+0.0466</w:t>
+            </w:r>
+          </w:p>
+        </w:tc>
+        <w:tc>
+          <w:tcPr>
+            <w:tcW w:type="dxa" w:w="960"/>
             <w:shd w:fill="FFFFFF"/>
             <w:tcMar>
               <w:top w:w="80" w:type="dxa"/>
@@ -4128,13 +4155,13 @@
                 <w:rFonts w:ascii="TH Sarabun PSK" w:hAnsi="TH Sarabun PSK"/>
                 <w:sz w:val="26"/>
               </w:rPr>
-              <w:t>0.2019</w:t>
-            </w:r>
-          </w:p>
-        </w:tc>
-        <w:tc>
-          <w:tcPr>
-            <w:tcW w:type="dxa" w:w="1080"/>
+              <w:t>**0.025** 🟢</w:t>
+            </w:r>
+          </w:p>
+        </w:tc>
+        <w:tc>
+          <w:tcPr>
+            <w:tcW w:type="dxa" w:w="960"/>
             <w:shd w:fill="FFFFFF"/>
             <w:tcMar>
               <w:top w:w="80" w:type="dxa"/>
@@ -4152,13 +4179,13 @@
                 <w:rFonts w:ascii="TH Sarabun PSK" w:hAnsi="TH Sarabun PSK"/>
                 <w:sz w:val="26"/>
               </w:rPr>
-              <w:t>0.2485</w:t>
-            </w:r>
-          </w:p>
-        </w:tc>
-        <w:tc>
-          <w:tcPr>
-            <w:tcW w:type="dxa" w:w="1080"/>
+              <w:t>+0.0498</w:t>
+            </w:r>
+          </w:p>
+        </w:tc>
+        <w:tc>
+          <w:tcPr>
+            <w:tcW w:type="dxa" w:w="960"/>
             <w:shd w:fill="FFFFFF"/>
             <w:tcMar>
               <w:top w:w="80" w:type="dxa"/>
@@ -4176,13 +4203,13 @@
                 <w:rFonts w:ascii="TH Sarabun PSK" w:hAnsi="TH Sarabun PSK"/>
                 <w:sz w:val="26"/>
               </w:rPr>
-              <w:t>**+0.0466**</w:t>
-            </w:r>
-          </w:p>
-        </w:tc>
-        <w:tc>
-          <w:tcPr>
-            <w:tcW w:type="dxa" w:w="1080"/>
+              <w:t>**0.005** 🟢</w:t>
+            </w:r>
+          </w:p>
+        </w:tc>
+        <w:tc>
+          <w:tcPr>
+            <w:tcW w:type="dxa" w:w="960"/>
             <w:shd w:fill="FFFFFF"/>
             <w:tcMar>
               <w:top w:w="80" w:type="dxa"/>
@@ -4200,13 +4227,13 @@
                 <w:rFonts w:ascii="TH Sarabun PSK" w:hAnsi="TH Sarabun PSK"/>
                 <w:sz w:val="26"/>
               </w:rPr>
-              <w:t>0.0063</w:t>
-            </w:r>
-          </w:p>
-        </w:tc>
-        <w:tc>
-          <w:tcPr>
-            <w:tcW w:type="dxa" w:w="1080"/>
+              <w:t>+0.0497</w:t>
+            </w:r>
+          </w:p>
+        </w:tc>
+        <w:tc>
+          <w:tcPr>
+            <w:tcW w:type="dxa" w:w="960"/>
             <w:shd w:fill="FFFFFF"/>
             <w:tcMar>
               <w:top w:w="80" w:type="dxa"/>
@@ -4224,13 +4251,13 @@
                 <w:rFonts w:ascii="TH Sarabun PSK" w:hAnsi="TH Sarabun PSK"/>
                 <w:sz w:val="26"/>
               </w:rPr>
-              <w:t>0.0251</w:t>
-            </w:r>
-          </w:p>
-        </w:tc>
-        <w:tc>
-          <w:tcPr>
-            <w:tcW w:type="dxa" w:w="1080"/>
+              <w:t>**0.001** 🟢</w:t>
+            </w:r>
+          </w:p>
+        </w:tc>
+        <w:tc>
+          <w:tcPr>
+            <w:tcW w:type="dxa" w:w="960"/>
             <w:shd w:fill="FFFFFF"/>
             <w:tcMar>
               <w:top w:w="80" w:type="dxa"/>
@@ -4248,16 +4275,14 @@
                 <w:rFonts w:ascii="TH Sarabun PSK" w:hAnsi="TH Sarabun PSK"/>
                 <w:sz w:val="26"/>
               </w:rPr>
-              <w:t>🟢 มีนัยสำคัญ ($p &lt; 0.05$)</w:t>
-            </w:r>
-          </w:p>
-        </w:tc>
-      </w:tr>
-      <w:tr>
-        <w:tc>
-          <w:tcPr>
-            <w:tcW w:type="dxa" w:w="1080"/>
-            <w:shd w:fill="FAFAFA"/>
+              <w:t>+0.0297</w:t>
+            </w:r>
+          </w:p>
+        </w:tc>
+        <w:tc>
+          <w:tcPr>
+            <w:tcW w:type="dxa" w:w="960"/>
+            <w:shd w:fill="FFFFFF"/>
             <w:tcMar>
               <w:top w:w="80" w:type="dxa"/>
               <w:bottom w:w="80" w:type="dxa"/>
@@ -4267,20 +4292,22 @@
           </w:tcPr>
           <w:p>
             <w:pPr>
-              <w:jc w:val="left"/>
+              <w:jc w:val="center"/>
             </w:pPr>
             <w:r>
               <w:rPr>
                 <w:rFonts w:ascii="TH Sarabun PSK" w:hAnsi="TH Sarabun PSK"/>
                 <w:sz w:val="26"/>
               </w:rPr>
-              <w:t>`naive_rag` vs `h2l-hybrid`</w:t>
-            </w:r>
-          </w:p>
-        </w:tc>
-        <w:tc>
-          <w:tcPr>
-            <w:tcW w:type="dxa" w:w="1080"/>
+              <w:t>0.057 🟡</w:t>
+            </w:r>
+          </w:p>
+        </w:tc>
+      </w:tr>
+      <w:tr>
+        <w:tc>
+          <w:tcPr>
+            <w:tcW w:type="dxa" w:w="960"/>
             <w:shd w:fill="FAFAFA"/>
             <w:tcMar>
               <w:top w:w="80" w:type="dxa"/>
@@ -4291,20 +4318,20 @@
           </w:tcPr>
           <w:p>
             <w:pPr>
-              <w:jc w:val="center"/>
+              <w:jc w:val="left"/>
             </w:pPr>
             <w:r>
               <w:rPr>
                 <w:rFonts w:ascii="TH Sarabun PSK" w:hAnsi="TH Sarabun PSK"/>
                 <w:sz w:val="26"/>
               </w:rPr>
-              <w:t>nDCG@10</w:t>
-            </w:r>
-          </w:p>
-        </w:tc>
-        <w:tc>
-          <w:tcPr>
-            <w:tcW w:type="dxa" w:w="1080"/>
+              <w:t>`hyde` vs `h2l-hybrid`</w:t>
+            </w:r>
+          </w:p>
+        </w:tc>
+        <w:tc>
+          <w:tcPr>
+            <w:tcW w:type="dxa" w:w="960"/>
             <w:shd w:fill="FAFAFA"/>
             <w:tcMar>
               <w:top w:w="80" w:type="dxa"/>
@@ -4322,13 +4349,13 @@
                 <w:rFonts w:ascii="TH Sarabun PSK" w:hAnsi="TH Sarabun PSK"/>
                 <w:sz w:val="26"/>
               </w:rPr>
-              <w:t>0.2236</w:t>
-            </w:r>
-          </w:p>
-        </w:tc>
-        <w:tc>
-          <w:tcPr>
-            <w:tcW w:type="dxa" w:w="1080"/>
+              <w:t>+0.1753</w:t>
+            </w:r>
+          </w:p>
+        </w:tc>
+        <w:tc>
+          <w:tcPr>
+            <w:tcW w:type="dxa" w:w="960"/>
             <w:shd w:fill="FAFAFA"/>
             <w:tcMar>
               <w:top w:w="80" w:type="dxa"/>
@@ -4346,13 +4373,13 @@
                 <w:rFonts w:ascii="TH Sarabun PSK" w:hAnsi="TH Sarabun PSK"/>
                 <w:sz w:val="26"/>
               </w:rPr>
-              <w:t>0.2734</w:t>
-            </w:r>
-          </w:p>
-        </w:tc>
-        <w:tc>
-          <w:tcPr>
-            <w:tcW w:type="dxa" w:w="1080"/>
+              <w:t>**0.000** 🟢</w:t>
+            </w:r>
+          </w:p>
+        </w:tc>
+        <w:tc>
+          <w:tcPr>
+            <w:tcW w:type="dxa" w:w="960"/>
             <w:shd w:fill="FAFAFA"/>
             <w:tcMar>
               <w:top w:w="80" w:type="dxa"/>
@@ -4370,13 +4397,13 @@
                 <w:rFonts w:ascii="TH Sarabun PSK" w:hAnsi="TH Sarabun PSK"/>
                 <w:sz w:val="26"/>
               </w:rPr>
-              <w:t>**+0.0498**</w:t>
-            </w:r>
-          </w:p>
-        </w:tc>
-        <w:tc>
-          <w:tcPr>
-            <w:tcW w:type="dxa" w:w="1080"/>
+              <w:t>+0.1813</w:t>
+            </w:r>
+          </w:p>
+        </w:tc>
+        <w:tc>
+          <w:tcPr>
+            <w:tcW w:type="dxa" w:w="960"/>
             <w:shd w:fill="FAFAFA"/>
             <w:tcMar>
               <w:top w:w="80" w:type="dxa"/>
@@ -4394,13 +4421,13 @@
                 <w:rFonts w:ascii="TH Sarabun PSK" w:hAnsi="TH Sarabun PSK"/>
                 <w:sz w:val="26"/>
               </w:rPr>
-              <w:t>0.0010</w:t>
-            </w:r>
-          </w:p>
-        </w:tc>
-        <w:tc>
-          <w:tcPr>
-            <w:tcW w:type="dxa" w:w="1080"/>
+              <w:t>**0.000** 🟢</w:t>
+            </w:r>
+          </w:p>
+        </w:tc>
+        <w:tc>
+          <w:tcPr>
+            <w:tcW w:type="dxa" w:w="960"/>
             <w:shd w:fill="FAFAFA"/>
             <w:tcMar>
               <w:top w:w="80" w:type="dxa"/>
@@ -4418,13 +4445,13 @@
                 <w:rFonts w:ascii="TH Sarabun PSK" w:hAnsi="TH Sarabun PSK"/>
                 <w:sz w:val="26"/>
               </w:rPr>
-              <w:t>0.0052</w:t>
-            </w:r>
-          </w:p>
-        </w:tc>
-        <w:tc>
-          <w:tcPr>
-            <w:tcW w:type="dxa" w:w="1080"/>
+              <w:t>+0.1767</w:t>
+            </w:r>
+          </w:p>
+        </w:tc>
+        <w:tc>
+          <w:tcPr>
+            <w:tcW w:type="dxa" w:w="960"/>
             <w:shd w:fill="FAFAFA"/>
             <w:tcMar>
               <w:top w:w="80" w:type="dxa"/>
@@ -4442,16 +4469,14 @@
                 <w:rFonts w:ascii="TH Sarabun PSK" w:hAnsi="TH Sarabun PSK"/>
                 <w:sz w:val="26"/>
               </w:rPr>
-              <w:t>🟢 มีนัยสำคัญ ($p &lt; 0.01$)</w:t>
-            </w:r>
-          </w:p>
-        </w:tc>
-      </w:tr>
-      <w:tr>
-        <w:tc>
-          <w:tcPr>
-            <w:tcW w:type="dxa" w:w="1080"/>
-            <w:shd w:fill="FFFFFF"/>
+              <w:t>**0.000** 🟢</w:t>
+            </w:r>
+          </w:p>
+        </w:tc>
+        <w:tc>
+          <w:tcPr>
+            <w:tcW w:type="dxa" w:w="960"/>
+            <w:shd w:fill="FAFAFA"/>
             <w:tcMar>
               <w:top w:w="80" w:type="dxa"/>
               <w:bottom w:w="80" w:type="dxa"/>
@@ -4461,21 +4486,21 @@
           </w:tcPr>
           <w:p>
             <w:pPr>
-              <w:jc w:val="left"/>
+              <w:jc w:val="center"/>
             </w:pPr>
             <w:r>
               <w:rPr>
                 <w:rFonts w:ascii="TH Sarabun PSK" w:hAnsi="TH Sarabun PSK"/>
                 <w:sz w:val="26"/>
               </w:rPr>
-              <w:t>`h2l-naive_rag` vs `h2l-hybrid`</w:t>
-            </w:r>
-          </w:p>
-        </w:tc>
-        <w:tc>
-          <w:tcPr>
-            <w:tcW w:type="dxa" w:w="1080"/>
-            <w:shd w:fill="FFFFFF"/>
+              <w:t>+0.2004</w:t>
+            </w:r>
+          </w:p>
+        </w:tc>
+        <w:tc>
+          <w:tcPr>
+            <w:tcW w:type="dxa" w:w="960"/>
+            <w:shd w:fill="FAFAFA"/>
             <w:tcMar>
               <w:top w:w="80" w:type="dxa"/>
               <w:bottom w:w="80" w:type="dxa"/>
@@ -4492,13 +4517,15 @@
                 <w:rFonts w:ascii="TH Sarabun PSK" w:hAnsi="TH Sarabun PSK"/>
                 <w:sz w:val="26"/>
               </w:rPr>
-              <w:t>nDCG@5</w:t>
-            </w:r>
-          </w:p>
-        </w:tc>
-        <w:tc>
-          <w:tcPr>
-            <w:tcW w:type="dxa" w:w="1080"/>
+              <w:t>**0.000** 🟢</w:t>
+            </w:r>
+          </w:p>
+        </w:tc>
+      </w:tr>
+      <w:tr>
+        <w:tc>
+          <w:tcPr>
+            <w:tcW w:type="dxa" w:w="960"/>
             <w:shd w:fill="FFFFFF"/>
             <w:tcMar>
               <w:top w:w="80" w:type="dxa"/>
@@ -4509,20 +4536,20 @@
           </w:tcPr>
           <w:p>
             <w:pPr>
-              <w:jc w:val="center"/>
+              <w:jc w:val="left"/>
             </w:pPr>
             <w:r>
               <w:rPr>
                 <w:rFonts w:ascii="TH Sarabun PSK" w:hAnsi="TH Sarabun PSK"/>
                 <w:sz w:val="26"/>
               </w:rPr>
-              <w:t>0.2017</w:t>
-            </w:r>
-          </w:p>
-        </w:tc>
-        <w:tc>
-          <w:tcPr>
-            <w:tcW w:type="dxa" w:w="1080"/>
+              <w:t>`h2l-naive_rag` vs `h2l-hybrid`</w:t>
+            </w:r>
+          </w:p>
+        </w:tc>
+        <w:tc>
+          <w:tcPr>
+            <w:tcW w:type="dxa" w:w="960"/>
             <w:shd w:fill="FFFFFF"/>
             <w:tcMar>
               <w:top w:w="80" w:type="dxa"/>
@@ -4540,13 +4567,13 @@
                 <w:rFonts w:ascii="TH Sarabun PSK" w:hAnsi="TH Sarabun PSK"/>
                 <w:sz w:val="26"/>
               </w:rPr>
-              <w:t>0.2485</w:t>
-            </w:r>
-          </w:p>
-        </w:tc>
-        <w:tc>
-          <w:tcPr>
-            <w:tcW w:type="dxa" w:w="1080"/>
+              <w:t>+0.0468</w:t>
+            </w:r>
+          </w:p>
+        </w:tc>
+        <w:tc>
+          <w:tcPr>
+            <w:tcW w:type="dxa" w:w="960"/>
             <w:shd w:fill="FFFFFF"/>
             <w:tcMar>
               <w:top w:w="80" w:type="dxa"/>
@@ -4564,13 +4591,13 @@
                 <w:rFonts w:ascii="TH Sarabun PSK" w:hAnsi="TH Sarabun PSK"/>
                 <w:sz w:val="26"/>
               </w:rPr>
-              <w:t>**+0.0468**</w:t>
-            </w:r>
-          </w:p>
-        </w:tc>
-        <w:tc>
-          <w:tcPr>
-            <w:tcW w:type="dxa" w:w="1080"/>
+              <w:t>**0.017** 🟢</w:t>
+            </w:r>
+          </w:p>
+        </w:tc>
+        <w:tc>
+          <w:tcPr>
+            <w:tcW w:type="dxa" w:w="960"/>
             <w:shd w:fill="FFFFFF"/>
             <w:tcMar>
               <w:top w:w="80" w:type="dxa"/>
@@ -4588,13 +4615,13 @@
                 <w:rFonts w:ascii="TH Sarabun PSK" w:hAnsi="TH Sarabun PSK"/>
                 <w:sz w:val="26"/>
               </w:rPr>
-              <w:t>0.0034</w:t>
-            </w:r>
-          </w:p>
-        </w:tc>
-        <w:tc>
-          <w:tcPr>
-            <w:tcW w:type="dxa" w:w="1080"/>
+              <w:t>+0.0415</w:t>
+            </w:r>
+          </w:p>
+        </w:tc>
+        <w:tc>
+          <w:tcPr>
+            <w:tcW w:type="dxa" w:w="960"/>
             <w:shd w:fill="FFFFFF"/>
             <w:tcMar>
               <w:top w:w="80" w:type="dxa"/>
@@ -4612,13 +4639,13 @@
                 <w:rFonts w:ascii="TH Sarabun PSK" w:hAnsi="TH Sarabun PSK"/>
                 <w:sz w:val="26"/>
               </w:rPr>
-              <w:t>0.0168</w:t>
-            </w:r>
-          </w:p>
-        </w:tc>
-        <w:tc>
-          <w:tcPr>
-            <w:tcW w:type="dxa" w:w="1080"/>
+              <w:t>**0.014** 🟢</w:t>
+            </w:r>
+          </w:p>
+        </w:tc>
+        <w:tc>
+          <w:tcPr>
+            <w:tcW w:type="dxa" w:w="960"/>
             <w:shd w:fill="FFFFFF"/>
             <w:tcMar>
               <w:top w:w="80" w:type="dxa"/>
@@ -4636,16 +4663,14 @@
                 <w:rFonts w:ascii="TH Sarabun PSK" w:hAnsi="TH Sarabun PSK"/>
                 <w:sz w:val="26"/>
               </w:rPr>
-              <w:t>🟢 มีนัยสำคัญ ($p &lt; 0.05$)</w:t>
-            </w:r>
-          </w:p>
-        </w:tc>
-      </w:tr>
-      <w:tr>
-        <w:tc>
-          <w:tcPr>
-            <w:tcW w:type="dxa" w:w="1080"/>
-            <w:shd w:fill="FAFAFA"/>
+              <w:t>+0.0468</w:t>
+            </w:r>
+          </w:p>
+        </w:tc>
+        <w:tc>
+          <w:tcPr>
+            <w:tcW w:type="dxa" w:w="960"/>
+            <w:shd w:fill="FFFFFF"/>
             <w:tcMar>
               <w:top w:w="80" w:type="dxa"/>
               <w:bottom w:w="80" w:type="dxa"/>
@@ -4655,21 +4680,21 @@
           </w:tcPr>
           <w:p>
             <w:pPr>
-              <w:jc w:val="left"/>
+              <w:jc w:val="center"/>
             </w:pPr>
             <w:r>
               <w:rPr>
                 <w:rFonts w:ascii="TH Sarabun PSK" w:hAnsi="TH Sarabun PSK"/>
                 <w:sz w:val="26"/>
               </w:rPr>
-              <w:t>`h2l-naive_rag` vs `h2l-hybrid`</w:t>
-            </w:r>
-          </w:p>
-        </w:tc>
-        <w:tc>
-          <w:tcPr>
-            <w:tcW w:type="dxa" w:w="1080"/>
-            <w:shd w:fill="FAFAFA"/>
+              <w:t>**0.001** 🟢</w:t>
+            </w:r>
+          </w:p>
+        </w:tc>
+        <w:tc>
+          <w:tcPr>
+            <w:tcW w:type="dxa" w:w="960"/>
+            <w:shd w:fill="FFFFFF"/>
             <w:tcMar>
               <w:top w:w="80" w:type="dxa"/>
               <w:bottom w:w="80" w:type="dxa"/>
@@ -4686,14 +4711,14 @@
                 <w:rFonts w:ascii="TH Sarabun PSK" w:hAnsi="TH Sarabun PSK"/>
                 <w:sz w:val="26"/>
               </w:rPr>
-              <w:t>nDCG@10</w:t>
-            </w:r>
-          </w:p>
-        </w:tc>
-        <w:tc>
-          <w:tcPr>
-            <w:tcW w:type="dxa" w:w="1080"/>
-            <w:shd w:fill="FAFAFA"/>
+              <w:t>+0.0180</w:t>
+            </w:r>
+          </w:p>
+        </w:tc>
+        <w:tc>
+          <w:tcPr>
+            <w:tcW w:type="dxa" w:w="960"/>
+            <w:shd w:fill="FFFFFF"/>
             <w:tcMar>
               <w:top w:w="80" w:type="dxa"/>
               <w:bottom w:w="80" w:type="dxa"/>
@@ -4710,13 +4735,15 @@
                 <w:rFonts w:ascii="TH Sarabun PSK" w:hAnsi="TH Sarabun PSK"/>
                 <w:sz w:val="26"/>
               </w:rPr>
-              <w:t>0.2319</w:t>
-            </w:r>
-          </w:p>
-        </w:tc>
-        <w:tc>
-          <w:tcPr>
-            <w:tcW w:type="dxa" w:w="1080"/>
+              <w:t>0.410 🔴</w:t>
+            </w:r>
+          </w:p>
+        </w:tc>
+      </w:tr>
+      <w:tr>
+        <w:tc>
+          <w:tcPr>
+            <w:tcW w:type="dxa" w:w="960"/>
             <w:shd w:fill="FAFAFA"/>
             <w:tcMar>
               <w:top w:w="80" w:type="dxa"/>
@@ -4727,20 +4754,20 @@
           </w:tcPr>
           <w:p>
             <w:pPr>
-              <w:jc w:val="center"/>
+              <w:jc w:val="left"/>
             </w:pPr>
             <w:r>
               <w:rPr>
                 <w:rFonts w:ascii="TH Sarabun PSK" w:hAnsi="TH Sarabun PSK"/>
                 <w:sz w:val="26"/>
               </w:rPr>
-              <w:t>0.2734</w:t>
-            </w:r>
-          </w:p>
-        </w:tc>
-        <w:tc>
-          <w:tcPr>
-            <w:tcW w:type="dxa" w:w="1080"/>
+              <w:t>`h2l-hyde` vs `h2l-hybrid`</w:t>
+            </w:r>
+          </w:p>
+        </w:tc>
+        <w:tc>
+          <w:tcPr>
+            <w:tcW w:type="dxa" w:w="960"/>
             <w:shd w:fill="FAFAFA"/>
             <w:tcMar>
               <w:top w:w="80" w:type="dxa"/>
@@ -4758,13 +4785,13 @@
                 <w:rFonts w:ascii="TH Sarabun PSK" w:hAnsi="TH Sarabun PSK"/>
                 <w:sz w:val="26"/>
               </w:rPr>
-              <w:t>**+0.0415**</w:t>
-            </w:r>
-          </w:p>
-        </w:tc>
-        <w:tc>
-          <w:tcPr>
-            <w:tcW w:type="dxa" w:w="1080"/>
+              <w:t>+0.1763</w:t>
+            </w:r>
+          </w:p>
+        </w:tc>
+        <w:tc>
+          <w:tcPr>
+            <w:tcW w:type="dxa" w:w="960"/>
             <w:shd w:fill="FAFAFA"/>
             <w:tcMar>
               <w:top w:w="80" w:type="dxa"/>
@@ -4782,13 +4809,13 @@
                 <w:rFonts w:ascii="TH Sarabun PSK" w:hAnsi="TH Sarabun PSK"/>
                 <w:sz w:val="26"/>
               </w:rPr>
-              <w:t>0.0034</w:t>
-            </w:r>
-          </w:p>
-        </w:tc>
-        <w:tc>
-          <w:tcPr>
-            <w:tcW w:type="dxa" w:w="1080"/>
+              <w:t>**0.000** 🟢</w:t>
+            </w:r>
+          </w:p>
+        </w:tc>
+        <w:tc>
+          <w:tcPr>
+            <w:tcW w:type="dxa" w:w="960"/>
             <w:shd w:fill="FAFAFA"/>
             <w:tcMar>
               <w:top w:w="80" w:type="dxa"/>
@@ -4806,13 +4833,13 @@
                 <w:rFonts w:ascii="TH Sarabun PSK" w:hAnsi="TH Sarabun PSK"/>
                 <w:sz w:val="26"/>
               </w:rPr>
-              <w:t>0.0135</w:t>
-            </w:r>
-          </w:p>
-        </w:tc>
-        <w:tc>
-          <w:tcPr>
-            <w:tcW w:type="dxa" w:w="1080"/>
+              <w:t>+0.1709</w:t>
+            </w:r>
+          </w:p>
+        </w:tc>
+        <w:tc>
+          <w:tcPr>
+            <w:tcW w:type="dxa" w:w="960"/>
             <w:shd w:fill="FAFAFA"/>
             <w:tcMar>
               <w:top w:w="80" w:type="dxa"/>
@@ -4830,16 +4857,14 @@
                 <w:rFonts w:ascii="TH Sarabun PSK" w:hAnsi="TH Sarabun PSK"/>
                 <w:sz w:val="26"/>
               </w:rPr>
-              <w:t>🟢 มีนัยสำคัญ ($p &lt; 0.05$)</w:t>
-            </w:r>
-          </w:p>
-        </w:tc>
-      </w:tr>
-      <w:tr>
-        <w:tc>
-          <w:tcPr>
-            <w:tcW w:type="dxa" w:w="1080"/>
-            <w:shd w:fill="FFFFFF"/>
+              <w:t>**0.000** 🟢</w:t>
+            </w:r>
+          </w:p>
+        </w:tc>
+        <w:tc>
+          <w:tcPr>
+            <w:tcW w:type="dxa" w:w="960"/>
+            <w:shd w:fill="FAFAFA"/>
             <w:tcMar>
               <w:top w:w="80" w:type="dxa"/>
               <w:bottom w:w="80" w:type="dxa"/>
@@ -4849,21 +4874,21 @@
           </w:tcPr>
           <w:p>
             <w:pPr>
-              <w:jc w:val="left"/>
+              <w:jc w:val="center"/>
             </w:pPr>
             <w:r>
               <w:rPr>
                 <w:rFonts w:ascii="TH Sarabun PSK" w:hAnsi="TH Sarabun PSK"/>
                 <w:sz w:val="26"/>
               </w:rPr>
-              <w:t>`bm25_only` vs `h2l-hybrid`</w:t>
-            </w:r>
-          </w:p>
-        </w:tc>
-        <w:tc>
-          <w:tcPr>
-            <w:tcW w:type="dxa" w:w="1080"/>
-            <w:shd w:fill="FFFFFF"/>
+              <w:t>+0.1660</w:t>
+            </w:r>
+          </w:p>
+        </w:tc>
+        <w:tc>
+          <w:tcPr>
+            <w:tcW w:type="dxa" w:w="960"/>
+            <w:shd w:fill="FAFAFA"/>
             <w:tcMar>
               <w:top w:w="80" w:type="dxa"/>
               <w:bottom w:w="80" w:type="dxa"/>
@@ -4880,14 +4905,14 @@
                 <w:rFonts w:ascii="TH Sarabun PSK" w:hAnsi="TH Sarabun PSK"/>
                 <w:sz w:val="26"/>
               </w:rPr>
-              <w:t>nDCG@5</w:t>
-            </w:r>
-          </w:p>
-        </w:tc>
-        <w:tc>
-          <w:tcPr>
-            <w:tcW w:type="dxa" w:w="1080"/>
-            <w:shd w:fill="FFFFFF"/>
+              <w:t>**0.000** 🟢</w:t>
+            </w:r>
+          </w:p>
+        </w:tc>
+        <w:tc>
+          <w:tcPr>
+            <w:tcW w:type="dxa" w:w="960"/>
+            <w:shd w:fill="FAFAFA"/>
             <w:tcMar>
               <w:top w:w="80" w:type="dxa"/>
               <w:bottom w:w="80" w:type="dxa"/>
@@ -4904,14 +4929,14 @@
                 <w:rFonts w:ascii="TH Sarabun PSK" w:hAnsi="TH Sarabun PSK"/>
                 <w:sz w:val="26"/>
               </w:rPr>
-              <w:t>0.2221</w:t>
-            </w:r>
-          </w:p>
-        </w:tc>
-        <w:tc>
-          <w:tcPr>
-            <w:tcW w:type="dxa" w:w="1080"/>
-            <w:shd w:fill="FFFFFF"/>
+              <w:t>+0.1905</w:t>
+            </w:r>
+          </w:p>
+        </w:tc>
+        <w:tc>
+          <w:tcPr>
+            <w:tcW w:type="dxa" w:w="960"/>
+            <w:shd w:fill="FAFAFA"/>
             <w:tcMar>
               <w:top w:w="80" w:type="dxa"/>
               <w:bottom w:w="80" w:type="dxa"/>
@@ -4928,13 +4953,15 @@
                 <w:rFonts w:ascii="TH Sarabun PSK" w:hAnsi="TH Sarabun PSK"/>
                 <w:sz w:val="26"/>
               </w:rPr>
-              <w:t>0.2485</w:t>
-            </w:r>
-          </w:p>
-        </w:tc>
-        <w:tc>
-          <w:tcPr>
-            <w:tcW w:type="dxa" w:w="1080"/>
+              <w:t>**0.000** 🟢</w:t>
+            </w:r>
+          </w:p>
+        </w:tc>
+      </w:tr>
+      <w:tr>
+        <w:tc>
+          <w:tcPr>
+            <w:tcW w:type="dxa" w:w="960"/>
             <w:shd w:fill="FFFFFF"/>
             <w:tcMar>
               <w:top w:w="80" w:type="dxa"/>
@@ -4945,20 +4972,20 @@
           </w:tcPr>
           <w:p>
             <w:pPr>
-              <w:jc w:val="center"/>
+              <w:jc w:val="left"/>
             </w:pPr>
             <w:r>
               <w:rPr>
                 <w:rFonts w:ascii="TH Sarabun PSK" w:hAnsi="TH Sarabun PSK"/>
                 <w:sz w:val="26"/>
               </w:rPr>
-              <w:t>+0.0263</w:t>
-            </w:r>
-          </w:p>
-        </w:tc>
-        <w:tc>
-          <w:tcPr>
-            <w:tcW w:type="dxa" w:w="1080"/>
+              <w:t>`bm25_only` vs `h2l-hybrid`</w:t>
+            </w:r>
+          </w:p>
+        </w:tc>
+        <w:tc>
+          <w:tcPr>
+            <w:tcW w:type="dxa" w:w="960"/>
             <w:shd w:fill="FFFFFF"/>
             <w:tcMar>
               <w:top w:w="80" w:type="dxa"/>
@@ -4976,13 +5003,13 @@
                 <w:rFonts w:ascii="TH Sarabun PSK" w:hAnsi="TH Sarabun PSK"/>
                 <w:sz w:val="26"/>
               </w:rPr>
-              <w:t>0.0450</w:t>
-            </w:r>
-          </w:p>
-        </w:tc>
-        <w:tc>
-          <w:tcPr>
-            <w:tcW w:type="dxa" w:w="1080"/>
+              <w:t>+0.0263</w:t>
+            </w:r>
+          </w:p>
+        </w:tc>
+        <w:tc>
+          <w:tcPr>
+            <w:tcW w:type="dxa" w:w="960"/>
             <w:shd w:fill="FFFFFF"/>
             <w:tcMar>
               <w:top w:w="80" w:type="dxa"/>
@@ -5000,13 +5027,13 @@
                 <w:rFonts w:ascii="TH Sarabun PSK" w:hAnsi="TH Sarabun PSK"/>
                 <w:sz w:val="26"/>
               </w:rPr>
-              <w:t>0.1349</w:t>
-            </w:r>
-          </w:p>
-        </w:tc>
-        <w:tc>
-          <w:tcPr>
-            <w:tcW w:type="dxa" w:w="1080"/>
+              <w:t>0.135 🔴</w:t>
+            </w:r>
+          </w:p>
+        </w:tc>
+        <w:tc>
+          <w:tcPr>
+            <w:tcW w:type="dxa" w:w="960"/>
             <w:shd w:fill="FFFFFF"/>
             <w:tcMar>
               <w:top w:w="80" w:type="dxa"/>
@@ -5024,16 +5051,14 @@
                 <w:rFonts w:ascii="TH Sarabun PSK" w:hAnsi="TH Sarabun PSK"/>
                 <w:sz w:val="26"/>
               </w:rPr>
-              <w:t>🟡 ไม่มีนัยสำคัญหลังปรับ Holm</w:t>
-            </w:r>
-          </w:p>
-        </w:tc>
-      </w:tr>
-      <w:tr>
-        <w:tc>
-          <w:tcPr>
-            <w:tcW w:type="dxa" w:w="1080"/>
-            <w:shd w:fill="FAFAFA"/>
+              <w:t>+0.0312</w:t>
+            </w:r>
+          </w:p>
+        </w:tc>
+        <w:tc>
+          <w:tcPr>
+            <w:tcW w:type="dxa" w:w="960"/>
+            <w:shd w:fill="FFFFFF"/>
             <w:tcMar>
               <w:top w:w="80" w:type="dxa"/>
               <w:bottom w:w="80" w:type="dxa"/>
@@ -5043,21 +5068,21 @@
           </w:tcPr>
           <w:p>
             <w:pPr>
-              <w:jc w:val="left"/>
+              <w:jc w:val="center"/>
             </w:pPr>
             <w:r>
               <w:rPr>
                 <w:rFonts w:ascii="TH Sarabun PSK" w:hAnsi="TH Sarabun PSK"/>
                 <w:sz w:val="26"/>
               </w:rPr>
-              <w:t>`basic` vs `h2l-hybrid`</w:t>
-            </w:r>
-          </w:p>
-        </w:tc>
-        <w:tc>
-          <w:tcPr>
-            <w:tcW w:type="dxa" w:w="1080"/>
-            <w:shd w:fill="FAFAFA"/>
+              <w:t>0.100 🔴</w:t>
+            </w:r>
+          </w:p>
+        </w:tc>
+        <w:tc>
+          <w:tcPr>
+            <w:tcW w:type="dxa" w:w="960"/>
+            <w:shd w:fill="FFFFFF"/>
             <w:tcMar>
               <w:top w:w="80" w:type="dxa"/>
               <w:bottom w:w="80" w:type="dxa"/>
@@ -5074,14 +5099,14 @@
                 <w:rFonts w:ascii="TH Sarabun PSK" w:hAnsi="TH Sarabun PSK"/>
                 <w:sz w:val="26"/>
               </w:rPr>
-              <w:t>nDCG@5</w:t>
-            </w:r>
-          </w:p>
-        </w:tc>
-        <w:tc>
-          <w:tcPr>
-            <w:tcW w:type="dxa" w:w="1080"/>
-            <w:shd w:fill="FAFAFA"/>
+              <w:t>+0.0177</w:t>
+            </w:r>
+          </w:p>
+        </w:tc>
+        <w:tc>
+          <w:tcPr>
+            <w:tcW w:type="dxa" w:w="960"/>
+            <w:shd w:fill="FFFFFF"/>
             <w:tcMar>
               <w:top w:w="80" w:type="dxa"/>
               <w:bottom w:w="80" w:type="dxa"/>
@@ -5098,14 +5123,14 @@
                 <w:rFonts w:ascii="TH Sarabun PSK" w:hAnsi="TH Sarabun PSK"/>
                 <w:sz w:val="26"/>
               </w:rPr>
-              <w:t>0.2351</w:t>
-            </w:r>
-          </w:p>
-        </w:tc>
-        <w:tc>
-          <w:tcPr>
-            <w:tcW w:type="dxa" w:w="1080"/>
-            <w:shd w:fill="FAFAFA"/>
+              <w:t>0.346 🔴</w:t>
+            </w:r>
+          </w:p>
+        </w:tc>
+        <w:tc>
+          <w:tcPr>
+            <w:tcW w:type="dxa" w:w="960"/>
+            <w:shd w:fill="FFFFFF"/>
             <w:tcMar>
               <w:top w:w="80" w:type="dxa"/>
               <w:bottom w:w="80" w:type="dxa"/>
@@ -5122,14 +5147,14 @@
                 <w:rFonts w:ascii="TH Sarabun PSK" w:hAnsi="TH Sarabun PSK"/>
                 <w:sz w:val="26"/>
               </w:rPr>
-              <w:t>0.2485</w:t>
-            </w:r>
-          </w:p>
-        </w:tc>
-        <w:tc>
-          <w:tcPr>
-            <w:tcW w:type="dxa" w:w="1080"/>
-            <w:shd w:fill="FAFAFA"/>
+              <w:t>+0.0029</w:t>
+            </w:r>
+          </w:p>
+        </w:tc>
+        <w:tc>
+          <w:tcPr>
+            <w:tcW w:type="dxa" w:w="960"/>
+            <w:shd w:fill="FFFFFF"/>
             <w:tcMar>
               <w:top w:w="80" w:type="dxa"/>
               <w:bottom w:w="80" w:type="dxa"/>
@@ -5146,13 +5171,15 @@
                 <w:rFonts w:ascii="TH Sarabun PSK" w:hAnsi="TH Sarabun PSK"/>
                 <w:sz w:val="26"/>
               </w:rPr>
-              <w:t>+0.0134</w:t>
-            </w:r>
-          </w:p>
-        </w:tc>
-        <w:tc>
-          <w:tcPr>
-            <w:tcW w:type="dxa" w:w="1080"/>
+              <w:t>0.635 🔴</w:t>
+            </w:r>
+          </w:p>
+        </w:tc>
+      </w:tr>
+      <w:tr>
+        <w:tc>
+          <w:tcPr>
+            <w:tcW w:type="dxa" w:w="960"/>
             <w:shd w:fill="FAFAFA"/>
             <w:tcMar>
               <w:top w:w="80" w:type="dxa"/>
@@ -5163,20 +5190,20 @@
           </w:tcPr>
           <w:p>
             <w:pPr>
-              <w:jc w:val="center"/>
+              <w:jc w:val="left"/>
             </w:pPr>
             <w:r>
               <w:rPr>
                 <w:rFonts w:ascii="TH Sarabun PSK" w:hAnsi="TH Sarabun PSK"/>
                 <w:sz w:val="26"/>
               </w:rPr>
-              <w:t>0.0640</w:t>
-            </w:r>
-          </w:p>
-        </w:tc>
-        <w:tc>
-          <w:tcPr>
-            <w:tcW w:type="dxa" w:w="1080"/>
+              <w:t>`basic` vs `h2l-hybrid`</w:t>
+            </w:r>
+          </w:p>
+        </w:tc>
+        <w:tc>
+          <w:tcPr>
+            <w:tcW w:type="dxa" w:w="960"/>
             <w:shd w:fill="FAFAFA"/>
             <w:tcMar>
               <w:top w:w="80" w:type="dxa"/>
@@ -5194,13 +5221,13 @@
                 <w:rFonts w:ascii="TH Sarabun PSK" w:hAnsi="TH Sarabun PSK"/>
                 <w:sz w:val="26"/>
               </w:rPr>
-              <w:t>0.1349</w:t>
-            </w:r>
-          </w:p>
-        </w:tc>
-        <w:tc>
-          <w:tcPr>
-            <w:tcW w:type="dxa" w:w="1080"/>
+              <w:t>+0.0134</w:t>
+            </w:r>
+          </w:p>
+        </w:tc>
+        <w:tc>
+          <w:tcPr>
+            <w:tcW w:type="dxa" w:w="960"/>
             <w:shd w:fill="FAFAFA"/>
             <w:tcMar>
               <w:top w:w="80" w:type="dxa"/>
@@ -5218,16 +5245,14 @@
                 <w:rFonts w:ascii="TH Sarabun PSK" w:hAnsi="TH Sarabun PSK"/>
                 <w:sz w:val="26"/>
               </w:rPr>
-              <w:t>🟡 ไม่มีนัยสำคัญหลังปรับ Holm</w:t>
-            </w:r>
-          </w:p>
-        </w:tc>
-      </w:tr>
-      <w:tr>
-        <w:tc>
-          <w:tcPr>
-            <w:tcW w:type="dxa" w:w="1080"/>
-            <w:shd w:fill="FFFFFF"/>
+              <w:t>0.135 🔴</w:t>
+            </w:r>
+          </w:p>
+        </w:tc>
+        <w:tc>
+          <w:tcPr>
+            <w:tcW w:type="dxa" w:w="960"/>
+            <w:shd w:fill="FAFAFA"/>
             <w:tcMar>
               <w:top w:w="80" w:type="dxa"/>
               <w:bottom w:w="80" w:type="dxa"/>
@@ -5237,21 +5262,21 @@
           </w:tcPr>
           <w:p>
             <w:pPr>
-              <w:jc w:val="left"/>
+              <w:jc w:val="center"/>
             </w:pPr>
             <w:r>
               <w:rPr>
                 <w:rFonts w:ascii="TH Sarabun PSK" w:hAnsi="TH Sarabun PSK"/>
                 <w:sz w:val="26"/>
               </w:rPr>
-              <w:t>`h2l-bm25` vs `h2l-hybrid`</w:t>
-            </w:r>
-          </w:p>
-        </w:tc>
-        <w:tc>
-          <w:tcPr>
-            <w:tcW w:type="dxa" w:w="1080"/>
-            <w:shd w:fill="FFFFFF"/>
+              <w:t>+0.0168</w:t>
+            </w:r>
+          </w:p>
+        </w:tc>
+        <w:tc>
+          <w:tcPr>
+            <w:tcW w:type="dxa" w:w="960"/>
+            <w:shd w:fill="FAFAFA"/>
             <w:tcMar>
               <w:top w:w="80" w:type="dxa"/>
               <w:bottom w:w="80" w:type="dxa"/>
@@ -5268,14 +5293,14 @@
                 <w:rFonts w:ascii="TH Sarabun PSK" w:hAnsi="TH Sarabun PSK"/>
                 <w:sz w:val="26"/>
               </w:rPr>
-              <w:t>nDCG@5</w:t>
-            </w:r>
-          </w:p>
-        </w:tc>
-        <w:tc>
-          <w:tcPr>
-            <w:tcW w:type="dxa" w:w="1080"/>
-            <w:shd w:fill="FFFFFF"/>
+              <w:t>0.100 🔴</w:t>
+            </w:r>
+          </w:p>
+        </w:tc>
+        <w:tc>
+          <w:tcPr>
+            <w:tcW w:type="dxa" w:w="960"/>
+            <w:shd w:fill="FAFAFA"/>
             <w:tcMar>
               <w:top w:w="80" w:type="dxa"/>
               <w:bottom w:w="80" w:type="dxa"/>
@@ -5292,14 +5317,14 @@
                 <w:rFonts w:ascii="TH Sarabun PSK" w:hAnsi="TH Sarabun PSK"/>
                 <w:sz w:val="26"/>
               </w:rPr>
-              <w:t>0.2369</w:t>
-            </w:r>
-          </w:p>
-        </w:tc>
-        <w:tc>
-          <w:tcPr>
-            <w:tcW w:type="dxa" w:w="1080"/>
-            <w:shd w:fill="FFFFFF"/>
+              <w:t>+0.0121</w:t>
+            </w:r>
+          </w:p>
+        </w:tc>
+        <w:tc>
+          <w:tcPr>
+            <w:tcW w:type="dxa" w:w="960"/>
+            <w:shd w:fill="FAFAFA"/>
             <w:tcMar>
               <w:top w:w="80" w:type="dxa"/>
               <w:bottom w:w="80" w:type="dxa"/>
@@ -5316,14 +5341,14 @@
                 <w:rFonts w:ascii="TH Sarabun PSK" w:hAnsi="TH Sarabun PSK"/>
                 <w:sz w:val="26"/>
               </w:rPr>
-              <w:t>0.2485</w:t>
-            </w:r>
-          </w:p>
-        </w:tc>
-        <w:tc>
-          <w:tcPr>
-            <w:tcW w:type="dxa" w:w="1080"/>
-            <w:shd w:fill="FFFFFF"/>
+              <w:t>0.346 🔴</w:t>
+            </w:r>
+          </w:p>
+        </w:tc>
+        <w:tc>
+          <w:tcPr>
+            <w:tcW w:type="dxa" w:w="960"/>
+            <w:shd w:fill="FAFAFA"/>
             <w:tcMar>
               <w:top w:w="80" w:type="dxa"/>
               <w:bottom w:w="80" w:type="dxa"/>
@@ -5340,14 +5365,14 @@
                 <w:rFonts w:ascii="TH Sarabun PSK" w:hAnsi="TH Sarabun PSK"/>
                 <w:sz w:val="26"/>
               </w:rPr>
-              <w:t>+0.0116</w:t>
-            </w:r>
-          </w:p>
-        </w:tc>
-        <w:tc>
-          <w:tcPr>
-            <w:tcW w:type="dxa" w:w="1080"/>
-            <w:shd w:fill="FFFFFF"/>
+              <w:t>+0.0115</w:t>
+            </w:r>
+          </w:p>
+        </w:tc>
+        <w:tc>
+          <w:tcPr>
+            <w:tcW w:type="dxa" w:w="960"/>
+            <w:shd w:fill="FAFAFA"/>
             <w:tcMar>
               <w:top w:w="80" w:type="dxa"/>
               <w:bottom w:w="80" w:type="dxa"/>
@@ -5364,13 +5389,15 @@
                 <w:rFonts w:ascii="TH Sarabun PSK" w:hAnsi="TH Sarabun PSK"/>
                 <w:sz w:val="26"/>
               </w:rPr>
-              <w:t>0.2904</w:t>
-            </w:r>
-          </w:p>
-        </w:tc>
-        <w:tc>
-          <w:tcPr>
-            <w:tcW w:type="dxa" w:w="1080"/>
+              <w:t>0.482 🔴</w:t>
+            </w:r>
+          </w:p>
+        </w:tc>
+      </w:tr>
+      <w:tr>
+        <w:tc>
+          <w:tcPr>
+            <w:tcW w:type="dxa" w:w="960"/>
             <w:shd w:fill="FFFFFF"/>
             <w:tcMar>
               <w:top w:w="80" w:type="dxa"/>
@@ -5381,20 +5408,20 @@
           </w:tcPr>
           <w:p>
             <w:pPr>
-              <w:jc w:val="center"/>
+              <w:jc w:val="left"/>
             </w:pPr>
             <w:r>
               <w:rPr>
                 <w:rFonts w:ascii="TH Sarabun PSK" w:hAnsi="TH Sarabun PSK"/>
                 <w:sz w:val="26"/>
               </w:rPr>
-              <w:t>0.2904</w:t>
-            </w:r>
-          </w:p>
-        </w:tc>
-        <w:tc>
-          <w:tcPr>
-            <w:tcW w:type="dxa" w:w="1080"/>
+              <w:t>`h2l-bm25` vs `h2l-hybrid`</w:t>
+            </w:r>
+          </w:p>
+        </w:tc>
+        <w:tc>
+          <w:tcPr>
+            <w:tcW w:type="dxa" w:w="960"/>
             <w:shd w:fill="FFFFFF"/>
             <w:tcMar>
               <w:top w:w="80" w:type="dxa"/>
@@ -5412,7 +5439,175 @@
                 <w:rFonts w:ascii="TH Sarabun PSK" w:hAnsi="TH Sarabun PSK"/>
                 <w:sz w:val="26"/>
               </w:rPr>
-              <w:t>🟡 ไม่มีนัยสำคัญ</w:t>
+              <w:t>+0.0116</w:t>
+            </w:r>
+          </w:p>
+        </w:tc>
+        <w:tc>
+          <w:tcPr>
+            <w:tcW w:type="dxa" w:w="960"/>
+            <w:shd w:fill="FFFFFF"/>
+            <w:tcMar>
+              <w:top w:w="80" w:type="dxa"/>
+              <w:bottom w:w="80" w:type="dxa"/>
+              <w:left w:w="100" w:type="dxa"/>
+              <w:right w:w="100" w:type="dxa"/>
+            </w:tcMar>
+          </w:tcPr>
+          <w:p>
+            <w:pPr>
+              <w:jc w:val="center"/>
+            </w:pPr>
+            <w:r>
+              <w:rPr>
+                <w:rFonts w:ascii="TH Sarabun PSK" w:hAnsi="TH Sarabun PSK"/>
+                <w:sz w:val="26"/>
+              </w:rPr>
+              <w:t>0.290 🔴</w:t>
+            </w:r>
+          </w:p>
+        </w:tc>
+        <w:tc>
+          <w:tcPr>
+            <w:tcW w:type="dxa" w:w="960"/>
+            <w:shd w:fill="FFFFFF"/>
+            <w:tcMar>
+              <w:top w:w="80" w:type="dxa"/>
+              <w:bottom w:w="80" w:type="dxa"/>
+              <w:left w:w="100" w:type="dxa"/>
+              <w:right w:w="100" w:type="dxa"/>
+            </w:tcMar>
+          </w:tcPr>
+          <w:p>
+            <w:pPr>
+              <w:jc w:val="center"/>
+            </w:pPr>
+            <w:r>
+              <w:rPr>
+                <w:rFonts w:ascii="TH Sarabun PSK" w:hAnsi="TH Sarabun PSK"/>
+                <w:sz w:val="26"/>
+              </w:rPr>
+              <w:t>+0.0170</w:t>
+            </w:r>
+          </w:p>
+        </w:tc>
+        <w:tc>
+          <w:tcPr>
+            <w:tcW w:type="dxa" w:w="960"/>
+            <w:shd w:fill="FFFFFF"/>
+            <w:tcMar>
+              <w:top w:w="80" w:type="dxa"/>
+              <w:bottom w:w="80" w:type="dxa"/>
+              <w:left w:w="100" w:type="dxa"/>
+              <w:right w:w="100" w:type="dxa"/>
+            </w:tcMar>
+          </w:tcPr>
+          <w:p>
+            <w:pPr>
+              <w:jc w:val="center"/>
+            </w:pPr>
+            <w:r>
+              <w:rPr>
+                <w:rFonts w:ascii="TH Sarabun PSK" w:hAnsi="TH Sarabun PSK"/>
+                <w:sz w:val="26"/>
+              </w:rPr>
+              <w:t>0.141 🔴</w:t>
+            </w:r>
+          </w:p>
+        </w:tc>
+        <w:tc>
+          <w:tcPr>
+            <w:tcW w:type="dxa" w:w="960"/>
+            <w:shd w:fill="FFFFFF"/>
+            <w:tcMar>
+              <w:top w:w="80" w:type="dxa"/>
+              <w:bottom w:w="80" w:type="dxa"/>
+              <w:left w:w="100" w:type="dxa"/>
+              <w:right w:w="100" w:type="dxa"/>
+            </w:tcMar>
+          </w:tcPr>
+          <w:p>
+            <w:pPr>
+              <w:jc w:val="center"/>
+            </w:pPr>
+            <w:r>
+              <w:rPr>
+                <w:rFonts w:ascii="TH Sarabun PSK" w:hAnsi="TH Sarabun PSK"/>
+                <w:sz w:val="26"/>
+              </w:rPr>
+              <w:t>+0.0234</w:t>
+            </w:r>
+          </w:p>
+        </w:tc>
+        <w:tc>
+          <w:tcPr>
+            <w:tcW w:type="dxa" w:w="960"/>
+            <w:shd w:fill="FFFFFF"/>
+            <w:tcMar>
+              <w:top w:w="80" w:type="dxa"/>
+              <w:bottom w:w="80" w:type="dxa"/>
+              <w:left w:w="100" w:type="dxa"/>
+              <w:right w:w="100" w:type="dxa"/>
+            </w:tcMar>
+          </w:tcPr>
+          <w:p>
+            <w:pPr>
+              <w:jc w:val="center"/>
+            </w:pPr>
+            <w:r>
+              <w:rPr>
+                <w:rFonts w:ascii="TH Sarabun PSK" w:hAnsi="TH Sarabun PSK"/>
+                <w:sz w:val="26"/>
+              </w:rPr>
+              <w:t>0.346 🔴</w:t>
+            </w:r>
+          </w:p>
+        </w:tc>
+        <w:tc>
+          <w:tcPr>
+            <w:tcW w:type="dxa" w:w="960"/>
+            <w:shd w:fill="FFFFFF"/>
+            <w:tcMar>
+              <w:top w:w="80" w:type="dxa"/>
+              <w:bottom w:w="80" w:type="dxa"/>
+              <w:left w:w="100" w:type="dxa"/>
+              <w:right w:w="100" w:type="dxa"/>
+            </w:tcMar>
+          </w:tcPr>
+          <w:p>
+            <w:pPr>
+              <w:jc w:val="center"/>
+            </w:pPr>
+            <w:r>
+              <w:rPr>
+                <w:rFonts w:ascii="TH Sarabun PSK" w:hAnsi="TH Sarabun PSK"/>
+                <w:sz w:val="26"/>
+              </w:rPr>
+              <w:t>+0.0190</w:t>
+            </w:r>
+          </w:p>
+        </w:tc>
+        <w:tc>
+          <w:tcPr>
+            <w:tcW w:type="dxa" w:w="960"/>
+            <w:shd w:fill="FFFFFF"/>
+            <w:tcMar>
+              <w:top w:w="80" w:type="dxa"/>
+              <w:bottom w:w="80" w:type="dxa"/>
+              <w:left w:w="100" w:type="dxa"/>
+              <w:right w:w="100" w:type="dxa"/>
+            </w:tcMar>
+          </w:tcPr>
+          <w:p>
+            <w:pPr>
+              <w:jc w:val="center"/>
+            </w:pPr>
+            <w:r>
+              <w:rPr>
+                <w:rFonts w:ascii="TH Sarabun PSK" w:hAnsi="TH Sarabun PSK"/>
+                <w:sz w:val="26"/>
+              </w:rPr>
+              <w:t>0.410 🔴</w:t>
             </w:r>
           </w:p>
         </w:tc>
@@ -5430,7 +5625,7 @@
           <w:color w:val="000000"/>
           <w:sz w:val="32"/>
         </w:rPr>
-        <w:t>หมายเหตุ: median ผลต่างรายกรณีเป็น 0 ในทุกคู่ เคสที่ต่างกันจริงมี 13–30 จาก 95 กรณีเท่านั้น แสดงว่าประโยชน์ของ H2L กระจุกอยู่ในกรณีศึกษาส่วนน้อย</w:t>
+        <w:t>🟢 มีนัยสำคัญ (Holm ≤ 0.05) · 🟡 ใกล้เกณฑ์ (0.057) · 🔴 ไม่มีนัยสำคัญ — Paired Two-Sided Wilcoxon แยก family ต่อตัวชี้วัด (7 คู่ต่อ family)</w:t>
       </w:r>
     </w:p>
     <w:p>
@@ -5455,25 +5650,7 @@
           <w:color w:val="000000"/>
           <w:sz w:val="32"/>
         </w:rPr>
-        <w:t xml:space="preserve"> </w:t>
-      </w:r>
-      <w:r>
-        <w:rPr>
-          <w:rFonts w:ascii="Courier New" w:hAnsi="Courier New"/>
-          <w:color w:val="B42828"/>
-          <w:sz w:val="30"/>
-        </w:rPr>
-        <w:t>h2l-hybrid</w:t>
-      </w:r>
-      <w:r>
-        <w:rPr>
-          <w:rFonts w:ascii="TH Sarabun PSK" w:hAnsi="TH Sarabun PSK"/>
-          <w:b w:val="0"/>
-          <w:i w:val="0"/>
-          <w:color w:val="000000"/>
-          <w:sz w:val="32"/>
-        </w:rPr>
-        <w:t xml:space="preserve"> เหนือกว่าอย่างมีนัยสำคัญ (หลังปรับ Holm) 4 จาก 7 คู่เทียบ ซึ่งได้แก่กลุ่ม naive RAG และ dense retrieval ทั้งสองเวอร์ชัน แต่ยังไม่แตกต่างอย่างมีนัยสำคัญจาก </w:t>
+        <w:t xml:space="preserve"> กลุ่ม naive RAG และ HyDE (ทั้งเวอร์ชันปกติและ H2L-augmented) มีนัยสำคัญในทุกตัวชี้วัดหลักยกเว้น MRR ของ naive_rag (Holm 0.057) ส่วน </w:t>
       </w:r>
       <w:r>
         <w:rPr>
@@ -5527,7 +5704,7 @@
           <w:color w:val="000000"/>
           <w:sz w:val="32"/>
         </w:rPr>
-        <w:t xml:space="preserve"> ซึ่งเป็น baseline ที่แข็งกว่า ประโยชน์ของ H2L ปรากฏชัดกว่าเมื่อพิจารณาที่ cutoff @10 เทียบกับ @5</w:t>
+        <w:t xml:space="preserve"> ไม่มีนัยสำคัญในทุกตัวชี้วัด แสดงว่าประโยชน์ของ H2L กระจุกอยู่กับ dense retrieval ที่อ่อน ไม่ใช่ sparse/hybrid ที่มีพลังคำสำคัญอยู่แล้ว</w:t>
       </w:r>
     </w:p>
     <w:p>

</xml_diff>